<commit_message>
Several improvements to wordings and model examples
</commit_message>
<xml_diff>
--- a/ContributionsForDiscussions/onmi2026.ND.003_AsonAstnControlPlaneRiaSketch.docx
+++ b/ContributionsForDiscussions/onmi2026.ND.003_AsonAstnControlPlaneRiaSketch.docx
@@ -15,136 +15,176 @@
         <w:t xml:space="preserve">This material is an early draft of </w:t>
       </w:r>
       <w:r>
-        <w:t xml:space="preserve">a section to be added to TR-547 for TAPI 2.7. There will be some small modifications to the TAPI model to accommodate the ASON/ASTN control plane. Some of these modifications are highlighted at the end of the document. </w:t>
-      </w:r>
-    </w:p>
-    <w:p>
-      <w:r>
-        <w:t>Need to add ASON/ASTN only view (where there is no visibility of the actual hardware</w:t>
-      </w:r>
-      <w:r>
-        <w:t xml:space="preserve"> – the SIP would need some kind of external reference to patch panel</w:t>
+        <w:t xml:space="preserve">a section to be added to TR-547 for TAPI 2.7. There will be some small modifications to the TAPI model to accommodate the ASON/ASTN control plane. Some of these modifications are highlighted </w:t>
+      </w:r>
+      <w:r>
+        <w:t>in this</w:t>
+      </w:r>
+      <w:r>
+        <w:t xml:space="preserve"> document. </w:t>
+      </w:r>
+    </w:p>
+    <w:p>
+      <w:r>
+        <w:t xml:space="preserve">Need to add multi-controller view both </w:t>
+      </w:r>
+      <w:r>
+        <w:t>in</w:t>
+      </w:r>
+      <w:r>
+        <w:t xml:space="preserve"> terms of </w:t>
+      </w:r>
+      <w:r>
+        <w:t>hierarchy and interdomain link.</w:t>
+      </w:r>
+    </w:p>
+    <w:p>
+      <w:r>
+        <w:t xml:space="preserve">Should highlight that there can only be one level of node and that to deal with multiple levels we would either need to change TAPI or </w:t>
+      </w:r>
+      <w:r>
+        <w:t xml:space="preserve">to have multiple topologies or to have multiple nodes where the hierarchy is defined by the </w:t>
+      </w:r>
+      <w:r>
+        <w:t xml:space="preserve">TP stack. The NEPs would be declared in one node along with its CEPs but the client CEP would be in another node. The nodes for </w:t>
+      </w:r>
+      <w:r>
+        <w:t xml:space="preserve">the control plane could either be the same as or different </w:t>
+      </w:r>
+      <w:r>
+        <w:t>from</w:t>
+      </w:r>
+      <w:r>
+        <w:t xml:space="preserve"> the node for</w:t>
+      </w:r>
+      <w:r>
+        <w:t xml:space="preserve"> concrete network model.</w:t>
+      </w:r>
+      <w:r>
+        <w:t xml:space="preserve"> The node view has not yet been included.</w:t>
+      </w:r>
+    </w:p>
+    <w:p>
+      <w:r>
+        <w:t xml:space="preserve">Need to rationalize terminology … </w:t>
+      </w:r>
+      <w:r>
+        <w:t xml:space="preserve">currently </w:t>
+      </w:r>
+      <w:r>
+        <w:t>actual</w:t>
+      </w:r>
+      <w:r>
+        <w:t xml:space="preserve"> network namespace and control plane namespace.</w:t>
+      </w:r>
+    </w:p>
+    <w:p>
+      <w:pPr>
+        <w:pStyle w:val="Heading1"/>
+      </w:pPr>
+      <w:r>
+        <w:t>Support for ASON/ASTN control plane</w:t>
+      </w:r>
+    </w:p>
+    <w:p>
+      <w:pPr>
+        <w:pStyle w:val="Heading2"/>
+      </w:pPr>
+      <w:r>
+        <w:t>Background</w:t>
+      </w:r>
+    </w:p>
+    <w:p>
+      <w:r>
+        <w:t xml:space="preserve">The TAPI model has been derived from the generalise network model developed in [ONF TR-512] (now maintained as [ITU-T G.7711]). That model was developed to cover all networking considerations including </w:t>
+      </w:r>
+      <w:r>
+        <w:t>alternative related</w:t>
+      </w:r>
+      <w:r>
+        <w:t xml:space="preserve"> abstractions.</w:t>
+      </w:r>
+    </w:p>
+    <w:p>
+      <w:r>
+        <w:t>E</w:t>
+      </w:r>
+      <w:r>
+        <w:t xml:space="preserve">ach class in the [ONF TR-512] model represents a broad semantic </w:t>
+      </w:r>
+      <w:r>
+        <w:t>volume</w:t>
+      </w:r>
+      <w:r>
+        <w:t xml:space="preserve"> with a well-defined boundary. The </w:t>
+      </w:r>
+      <w:r>
+        <w:t xml:space="preserve">developing </w:t>
+      </w:r>
+      <w:r>
+        <w:t xml:space="preserve">class </w:t>
+      </w:r>
+      <w:r>
+        <w:t>detail is de</w:t>
+      </w:r>
+      <w:r>
+        <w:t>fined via composition/augmentation and not via sub-classing. For example, the LTP (Logical Termination Point) applies to all cases of termination without subclassing.</w:t>
+      </w:r>
+      <w:r>
+        <w:t xml:space="preserve"> Properties and structure is added as it becomes apparent and necessary.</w:t>
+      </w:r>
+    </w:p>
+    <w:p>
+      <w:r>
+        <w:t>When [TMF814] was developed to cover the ASON</w:t>
+      </w:r>
+      <w:r>
+        <w:t>/ASTN</w:t>
+      </w:r>
+      <w:r>
+        <w:t xml:space="preserve"> control plane new classes for termination and connectivity were defined following the recommendations for ASON/ASTN current in ITU-T at the time.</w:t>
+      </w:r>
+      <w:r>
+        <w:t xml:space="preserve"> The ASON/ASTN control plane was related to the existing network view that has a very direct relationship with the </w:t>
+      </w:r>
+      <w:r>
+        <w:t xml:space="preserve">image of the </w:t>
+      </w:r>
+      <w:r>
+        <w:t>representation of the actual net</w:t>
+      </w:r>
+      <w:r>
+        <w:t>work resources</w:t>
+      </w:r>
+      <w:r>
+        <w:t xml:space="preserve"> (</w:t>
+      </w:r>
+      <w:r>
+        <w:t>this will be abbreviated to “</w:t>
+      </w:r>
+      <w:r>
+        <w:t>actual</w:t>
+      </w:r>
+      <w:r>
+        <w:t xml:space="preserve"> resources”</w:t>
       </w:r>
       <w:r>
         <w:t>)</w:t>
       </w:r>
       <w:r>
-        <w:t>.</w:t>
-      </w:r>
-    </w:p>
-    <w:p>
-      <w:r>
-        <w:t xml:space="preserve">Need to add multi-controller view both </w:t>
-      </w:r>
-      <w:r>
-        <w:t>in</w:t>
-      </w:r>
-      <w:r>
-        <w:t xml:space="preserve"> terms of </w:t>
-      </w:r>
-      <w:r>
-        <w:t>hierarchy and interdomain link.</w:t>
-      </w:r>
-    </w:p>
-    <w:p>
-      <w:r>
-        <w:t xml:space="preserve">Should highlight that there can only be one level of node and that to deal with multiple levels we would either need to change TAPI or </w:t>
-      </w:r>
-      <w:r>
-        <w:t xml:space="preserve">to have multiple topologies or to have multiple nodes where the hierarchy is defined by the </w:t>
-      </w:r>
-      <w:r>
-        <w:t xml:space="preserve">TP stack. The NEPs would be declared in one node along with its </w:t>
-      </w:r>
-      <w:proofErr w:type="gramStart"/>
-      <w:r>
-        <w:t>CEPs</w:t>
-      </w:r>
-      <w:proofErr w:type="gramEnd"/>
-      <w:r>
-        <w:t xml:space="preserve"> but the client CEP would be in another node. The nodes for </w:t>
-      </w:r>
-      <w:r>
-        <w:t xml:space="preserve">the control plane could either be the same as or different </w:t>
-      </w:r>
-      <w:r>
-        <w:t>from</w:t>
-      </w:r>
-      <w:r>
-        <w:t xml:space="preserve"> the node for</w:t>
-      </w:r>
-      <w:r>
-        <w:t xml:space="preserve"> concrete network model.</w:t>
-      </w:r>
-      <w:r>
-        <w:t xml:space="preserve"> The node view has not yet been included.</w:t>
-      </w:r>
-    </w:p>
-    <w:p>
-      <w:pPr>
-        <w:pStyle w:val="Heading1"/>
-      </w:pPr>
-      <w:r>
-        <w:t>Support for ASON/ASTN control plane</w:t>
-      </w:r>
-    </w:p>
-    <w:p>
-      <w:pPr>
-        <w:pStyle w:val="Heading2"/>
-      </w:pPr>
-      <w:r>
-        <w:t>Background</w:t>
-      </w:r>
-    </w:p>
-    <w:p>
-      <w:r>
-        <w:t xml:space="preserve">The TAPI model has been derived from the generalise network model developed in [ONF TR-512] (now maintained as [ITU-T G.7711]). That model was developed to cover all networking considerations including </w:t>
-      </w:r>
-      <w:r>
-        <w:t>alternative related</w:t>
-      </w:r>
-      <w:r>
-        <w:t xml:space="preserve"> abstractions.</w:t>
-      </w:r>
-    </w:p>
-    <w:p>
-      <w:r>
-        <w:t xml:space="preserve">Each class in the [ONF TR-512] model represents a broad semantic </w:t>
-      </w:r>
-      <w:r>
-        <w:t>volume</w:t>
-      </w:r>
-      <w:r>
-        <w:t xml:space="preserve"> with a well-defined boundary. The </w:t>
-      </w:r>
-      <w:r>
-        <w:t xml:space="preserve">developing </w:t>
-      </w:r>
-      <w:r>
-        <w:t xml:space="preserve">class </w:t>
-      </w:r>
-      <w:r>
-        <w:t>detail is de</w:t>
-      </w:r>
-      <w:r>
-        <w:t>fined via composition/augmentation and not via sub-classing. For example, the LTP (Logical Termination Point) applies to all cases of termination without subclassing.</w:t>
-      </w:r>
-      <w:r>
-        <w:t xml:space="preserve"> Properties and structure is added as it becomes apparent and necessary.</w:t>
-      </w:r>
-    </w:p>
-    <w:p>
-      <w:r>
-        <w:t>When [TMF814] was developed to cover the ASON</w:t>
-      </w:r>
-      <w:r>
-        <w:t>/ASTN</w:t>
-      </w:r>
-      <w:r>
-        <w:t xml:space="preserve"> control plane new classes for termination and connectivity were defined following the recommendations for ASON/ASTN current in ITU-T at the time.</w:t>
-      </w:r>
-      <w:r>
-        <w:t xml:space="preserve"> The ASON/ASTN control plane was related to the existing network view that has a very direct relationship with the real network resources. The ASON/ASTN control plane was considered to be in a different namespace from the representation of the real network.  Both the “real” network representation and the control plan representation were related and presented in one single view. This allowed the higher controller/orchestrator to navigate between the two representations in one view.</w:t>
+        <w:t xml:space="preserve">. The ASON/ASTN control plane was considered to be in a different namespace from the </w:t>
+      </w:r>
+      <w:r>
+        <w:t>namespace of the actual resources</w:t>
+      </w:r>
+      <w:r>
+        <w:t xml:space="preserve">.  Both the </w:t>
+      </w:r>
+      <w:r>
+        <w:t>actual</w:t>
+      </w:r>
+      <w:r>
+        <w:t xml:space="preserve"> network representation and the control plan representation were related and presented in one single view. This allowed the higher controller/orchestrator to navigate between the two representations in one view.</w:t>
       </w:r>
     </w:p>
     <w:p>
@@ -174,7 +214,13 @@
     </w:p>
     <w:p>
       <w:r>
-        <w:t xml:space="preserve">The following section describes the model usage and highlights the specific augments. The augments have been intentionally generalized so as to be  where those augments </w:t>
+        <w:t>The following section describes the model usage and highlights the specific augments. The augments have been intentionally generalized</w:t>
+      </w:r>
+      <w:r>
+        <w:t xml:space="preserve"> so as to be applicable to </w:t>
+      </w:r>
+      <w:r>
+        <w:t>control plane solutions beyond ASON/ASTN.</w:t>
       </w:r>
     </w:p>
     <w:p>
@@ -195,34 +241,870 @@
       <w:r>
         <w:t>02] entity name and description and the corresponding TAPI mapping.</w:t>
       </w:r>
-    </w:p>
+      <w:r>
+        <w:t xml:space="preserve"> </w:t>
+      </w:r>
+    </w:p>
+    <w:tbl>
+      <w:tblPr>
+        <w:tblStyle w:val="TableGrid"/>
+        <w:tblW w:w="0" w:type="auto"/>
+        <w:tblLook w:val="04A0" w:firstRow="1" w:lastRow="0" w:firstColumn="1" w:lastColumn="0" w:noHBand="0" w:noVBand="1"/>
+      </w:tblPr>
+      <w:tblGrid>
+        <w:gridCol w:w="3083"/>
+        <w:gridCol w:w="2926"/>
+        <w:gridCol w:w="3007"/>
+      </w:tblGrid>
+      <w:tr>
+        <w:tc>
+          <w:tcPr>
+            <w:tcW w:w="3083" w:type="dxa"/>
+          </w:tcPr>
+          <w:p>
+            <w:pPr>
+              <w:rPr>
+                <w:b/>
+              </w:rPr>
+            </w:pPr>
+            <w:r>
+              <w:rPr>
+                <w:rFonts w:hint="eastAsia"/>
+                <w:b/>
+              </w:rPr>
+              <w:t>T</w:t>
+            </w:r>
+            <w:r>
+              <w:rPr>
+                <w:b/>
+              </w:rPr>
+              <w:t>API Concepts</w:t>
+            </w:r>
+          </w:p>
+        </w:tc>
+        <w:tc>
+          <w:tcPr>
+            <w:tcW w:w="2926" w:type="dxa"/>
+          </w:tcPr>
+          <w:p>
+            <w:pPr>
+              <w:rPr>
+                <w:b/>
+              </w:rPr>
+            </w:pPr>
+            <w:r>
+              <w:rPr>
+                <w:b/>
+              </w:rPr>
+              <w:t xml:space="preserve">CPI in </w:t>
+            </w:r>
+            <w:r>
+              <w:rPr>
+                <w:rFonts w:hint="eastAsia"/>
+                <w:b/>
+              </w:rPr>
+              <w:t>G</w:t>
+            </w:r>
+            <w:r>
+              <w:rPr>
+                <w:b/>
+              </w:rPr>
+              <w:t>.7702 Concepts</w:t>
+            </w:r>
+          </w:p>
+        </w:tc>
+        <w:tc>
+          <w:tcPr>
+            <w:tcW w:w="3007" w:type="dxa"/>
+          </w:tcPr>
+          <w:p>
+            <w:pPr>
+              <w:rPr>
+                <w:b/>
+              </w:rPr>
+            </w:pPr>
+            <w:r>
+              <w:rPr>
+                <w:b/>
+              </w:rPr>
+              <w:t>Notes</w:t>
+            </w:r>
+          </w:p>
+        </w:tc>
+      </w:tr>
+      <w:tr>
+        <w:tc>
+          <w:tcPr>
+            <w:tcW w:w="3083" w:type="dxa"/>
+          </w:tcPr>
+          <w:p>
+            <w:r>
+              <w:rPr>
+                <w:rFonts w:hint="eastAsia"/>
+              </w:rPr>
+              <w:t>T</w:t>
+            </w:r>
+            <w:r>
+              <w:t>API</w:t>
+            </w:r>
+          </w:p>
+        </w:tc>
+        <w:tc>
+          <w:tcPr>
+            <w:tcW w:w="2926" w:type="dxa"/>
+          </w:tcPr>
+          <w:p>
+            <w:r>
+              <w:rPr>
+                <w:rFonts w:hint="eastAsia"/>
+              </w:rPr>
+              <w:t>C</w:t>
+            </w:r>
+            <w:r>
+              <w:t>PI</w:t>
+            </w:r>
+          </w:p>
+        </w:tc>
+        <w:tc>
+          <w:tcPr>
+            <w:tcW w:w="3007" w:type="dxa"/>
+          </w:tcPr>
+          <w:p/>
+        </w:tc>
+      </w:tr>
+      <w:tr>
+        <w:tc>
+          <w:tcPr>
+            <w:tcW w:w="3083" w:type="dxa"/>
+          </w:tcPr>
+          <w:p>
+            <w:r>
+              <w:t>S</w:t>
+            </w:r>
+            <w:r>
+              <w:rPr>
+                <w:rFonts w:hint="eastAsia"/>
+              </w:rPr>
+              <w:t>hared</w:t>
+            </w:r>
+            <w:r>
+              <w:t xml:space="preserve"> context</w:t>
+            </w:r>
+          </w:p>
+        </w:tc>
+        <w:tc>
+          <w:tcPr>
+            <w:tcW w:w="2926" w:type="dxa"/>
+          </w:tcPr>
+          <w:p>
+            <w:r>
+              <w:t>C</w:t>
+            </w:r>
+            <w:r>
+              <w:rPr>
+                <w:rFonts w:hint="eastAsia"/>
+              </w:rPr>
+              <w:t>lient</w:t>
+            </w:r>
+            <w:r>
+              <w:t xml:space="preserve"> context + CPI</w:t>
+            </w:r>
+          </w:p>
+        </w:tc>
+        <w:tc>
+          <w:tcPr>
+            <w:tcW w:w="3007" w:type="dxa"/>
+          </w:tcPr>
+          <w:p/>
+        </w:tc>
+      </w:tr>
+      <w:tr>
+        <w:tc>
+          <w:tcPr>
+            <w:tcW w:w="3083" w:type="dxa"/>
+          </w:tcPr>
+          <w:p>
+            <w:r>
+              <w:t>Topology</w:t>
+            </w:r>
+          </w:p>
+        </w:tc>
+        <w:tc>
+          <w:tcPr>
+            <w:tcW w:w="2926" w:type="dxa"/>
+          </w:tcPr>
+          <w:p>
+            <w:r>
+              <w:t>Multiple Layer network</w:t>
+            </w:r>
+          </w:p>
+        </w:tc>
+        <w:tc>
+          <w:tcPr>
+            <w:tcW w:w="3007" w:type="dxa"/>
+          </w:tcPr>
+          <w:p>
+            <w:r>
+              <w:t>At the top</w:t>
+            </w:r>
+            <w:r>
+              <w:t>-</w:t>
+            </w:r>
+            <w:r>
+              <w:t>level vision</w:t>
+            </w:r>
+          </w:p>
+        </w:tc>
+      </w:tr>
+      <w:tr>
+        <w:tc>
+          <w:tcPr>
+            <w:tcW w:w="3083" w:type="dxa"/>
+          </w:tcPr>
+          <w:p>
+            <w:r>
+              <w:t>Topology/Node</w:t>
+            </w:r>
+          </w:p>
+        </w:tc>
+        <w:tc>
+          <w:tcPr>
+            <w:tcW w:w="2926" w:type="dxa"/>
+          </w:tcPr>
+          <w:p>
+            <w:r>
+              <w:rPr>
+                <w:rFonts w:hint="eastAsia"/>
+              </w:rPr>
+              <w:t>Subnetwork</w:t>
+            </w:r>
+          </w:p>
+        </w:tc>
+        <w:tc>
+          <w:tcPr>
+            <w:tcW w:w="3007" w:type="dxa"/>
+          </w:tcPr>
+          <w:p>
+            <w:r>
+              <w:rPr>
+                <w:rFonts w:hint="eastAsia"/>
+              </w:rPr>
+              <w:t>Subnetwork</w:t>
+            </w:r>
+            <w:r>
+              <w:t xml:space="preserve"> </w:t>
+            </w:r>
+            <w:r>
+              <w:t>is recursive vision while Node is the lowest vision.</w:t>
+            </w:r>
+          </w:p>
+        </w:tc>
+      </w:tr>
+      <w:tr>
+        <w:tc>
+          <w:tcPr>
+            <w:tcW w:w="3083" w:type="dxa"/>
+          </w:tcPr>
+          <w:p>
+            <w:r>
+              <w:rPr>
+                <w:rFonts w:hint="eastAsia"/>
+              </w:rPr>
+              <w:t>L</w:t>
+            </w:r>
+            <w:r>
+              <w:t>ink</w:t>
+            </w:r>
+          </w:p>
+        </w:tc>
+        <w:tc>
+          <w:tcPr>
+            <w:tcW w:w="2926" w:type="dxa"/>
+          </w:tcPr>
+          <w:p>
+            <w:r>
+              <w:rPr>
+                <w:rFonts w:hint="eastAsia"/>
+              </w:rPr>
+              <w:t>L</w:t>
+            </w:r>
+            <w:r>
+              <w:t>ink</w:t>
+            </w:r>
+          </w:p>
+        </w:tc>
+        <w:tc>
+          <w:tcPr>
+            <w:tcW w:w="3007" w:type="dxa"/>
+          </w:tcPr>
+          <w:p>
+            <w:r>
+              <w:t>A representation of capacity between nodes.</w:t>
+            </w:r>
+          </w:p>
+        </w:tc>
+      </w:tr>
+      <w:tr>
+        <w:tc>
+          <w:tcPr>
+            <w:tcW w:w="3083" w:type="dxa"/>
+          </w:tcPr>
+          <w:p>
+            <w:r>
+              <w:rPr>
+                <w:rFonts w:hint="eastAsia"/>
+              </w:rPr>
+              <w:t>SIP</w:t>
+            </w:r>
+          </w:p>
+        </w:tc>
+        <w:tc>
+          <w:tcPr>
+            <w:tcW w:w="2926" w:type="dxa"/>
+          </w:tcPr>
+          <w:p>
+            <w:r>
+              <w:rPr>
+                <w:rFonts w:hint="eastAsia"/>
+              </w:rPr>
+              <w:t>B</w:t>
+            </w:r>
+            <w:r>
+              <w:t>RI</w:t>
+            </w:r>
+          </w:p>
+        </w:tc>
+        <w:tc>
+          <w:tcPr>
+            <w:tcW w:w="3007" w:type="dxa"/>
+          </w:tcPr>
+          <w:p>
+            <w:r>
+              <w:rPr>
+                <w:rFonts w:hint="eastAsia"/>
+              </w:rPr>
+              <w:t>The boundary of the network</w:t>
+            </w:r>
+            <w:r>
+              <w:t xml:space="preserve"> used for Service/Call</w:t>
+            </w:r>
+          </w:p>
+        </w:tc>
+      </w:tr>
+      <w:tr>
+        <w:tc>
+          <w:tcPr>
+            <w:tcW w:w="3083" w:type="dxa"/>
+          </w:tcPr>
+          <w:p>
+            <w:r>
+              <w:rPr>
+                <w:rFonts w:hint="eastAsia"/>
+              </w:rPr>
+              <w:t>N</w:t>
+            </w:r>
+            <w:r>
+              <w:t>EP</w:t>
+            </w:r>
+          </w:p>
+        </w:tc>
+        <w:tc>
+          <w:tcPr>
+            <w:tcW w:w="2926" w:type="dxa"/>
+          </w:tcPr>
+          <w:p>
+            <w:r>
+              <w:rPr>
+                <w:rFonts w:hint="eastAsia"/>
+              </w:rPr>
+              <w:t>S</w:t>
+            </w:r>
+            <w:r>
+              <w:t>NPP</w:t>
+            </w:r>
+          </w:p>
+        </w:tc>
+        <w:tc>
+          <w:tcPr>
+            <w:tcW w:w="3007" w:type="dxa"/>
+          </w:tcPr>
+          <w:p>
+            <w:r>
+              <w:t>A</w:t>
+            </w:r>
+            <w:r>
+              <w:t xml:space="preserve"> pool of</w:t>
+            </w:r>
+            <w:r>
+              <w:t xml:space="preserve"> forwarding/</w:t>
+            </w:r>
+            <w:r>
+              <w:t xml:space="preserve"> termination</w:t>
+            </w:r>
+            <w:r>
+              <w:t xml:space="preserve"> resource</w:t>
+            </w:r>
+            <w:r>
+              <w:t>s</w:t>
+            </w:r>
+          </w:p>
+        </w:tc>
+      </w:tr>
+      <w:tr>
+        <w:tc>
+          <w:tcPr>
+            <w:tcW w:w="3083" w:type="dxa"/>
+          </w:tcPr>
+          <w:p>
+            <w:r>
+              <w:t>CEP</w:t>
+            </w:r>
+          </w:p>
+        </w:tc>
+        <w:tc>
+          <w:tcPr>
+            <w:tcW w:w="2926" w:type="dxa"/>
+          </w:tcPr>
+          <w:p>
+            <w:r>
+              <w:t>SNP</w:t>
+            </w:r>
+          </w:p>
+        </w:tc>
+        <w:tc>
+          <w:tcPr>
+            <w:tcW w:w="3007" w:type="dxa"/>
+          </w:tcPr>
+          <w:p>
+            <w:r>
+              <w:rPr>
+                <w:rFonts w:hint="eastAsia"/>
+              </w:rPr>
+              <w:t>T</w:t>
+            </w:r>
+            <w:r>
+              <w:rPr>
+                <w:rFonts w:hint="eastAsia"/>
+              </w:rPr>
+              <w:t>he forwarding</w:t>
+            </w:r>
+            <w:r>
+              <w:t xml:space="preserve"> point</w:t>
+            </w:r>
+            <w:r>
+              <w:t xml:space="preserve"> (</w:t>
+            </w:r>
+            <w:r>
+              <w:t xml:space="preserve">potentially </w:t>
+            </w:r>
+            <w:r>
+              <w:t>with</w:t>
+            </w:r>
+            <w:r>
+              <w:t xml:space="preserve"> a</w:t>
+            </w:r>
+            <w:r>
+              <w:t xml:space="preserve"> termination functions)</w:t>
+            </w:r>
+          </w:p>
+        </w:tc>
+      </w:tr>
+      <w:tr>
+        <w:tc>
+          <w:tcPr>
+            <w:tcW w:w="3083" w:type="dxa"/>
+          </w:tcPr>
+          <w:p>
+            <w:r>
+              <w:rPr>
+                <w:rFonts w:hint="eastAsia"/>
+              </w:rPr>
+              <w:t>Connectivity-Service</w:t>
+            </w:r>
+          </w:p>
+        </w:tc>
+        <w:tc>
+          <w:tcPr>
+            <w:tcW w:w="2926" w:type="dxa"/>
+          </w:tcPr>
+          <w:p>
+            <w:r>
+              <w:rPr>
+                <w:rFonts w:hint="eastAsia"/>
+              </w:rPr>
+              <w:t>C</w:t>
+            </w:r>
+            <w:r>
+              <w:t>all</w:t>
+            </w:r>
+          </w:p>
+        </w:tc>
+        <w:tc>
+          <w:tcPr>
+            <w:tcW w:w="3007" w:type="dxa"/>
+          </w:tcPr>
+          <w:p>
+            <w:r>
+              <w:t>Request for connectivity/service</w:t>
+            </w:r>
+            <w:r>
+              <w:t>. An intent.</w:t>
+            </w:r>
+          </w:p>
+        </w:tc>
+      </w:tr>
+      <w:tr>
+        <w:tc>
+          <w:tcPr>
+            <w:tcW w:w="3083" w:type="dxa"/>
+          </w:tcPr>
+          <w:p>
+            <w:r>
+              <w:t>C</w:t>
+            </w:r>
+            <w:r>
+              <w:rPr>
+                <w:rFonts w:hint="eastAsia"/>
+              </w:rPr>
+              <w:t>onnection</w:t>
+            </w:r>
+          </w:p>
+        </w:tc>
+        <w:tc>
+          <w:tcPr>
+            <w:tcW w:w="2926" w:type="dxa"/>
+          </w:tcPr>
+          <w:p>
+            <w:r>
+              <w:t>C</w:t>
+            </w:r>
+            <w:r>
+              <w:rPr>
+                <w:rFonts w:hint="eastAsia"/>
+              </w:rPr>
+              <w:t>onnect</w:t>
+            </w:r>
+            <w:r>
+              <w:t>ion</w:t>
+            </w:r>
+          </w:p>
+        </w:tc>
+        <w:tc>
+          <w:tcPr>
+            <w:tcW w:w="3007" w:type="dxa"/>
+          </w:tcPr>
+          <w:p>
+            <w:r>
+              <w:t>A forwarding relationship</w:t>
+            </w:r>
+          </w:p>
+        </w:tc>
+      </w:tr>
+      <w:tr>
+        <w:tc>
+          <w:tcPr>
+            <w:tcW w:w="3083" w:type="dxa"/>
+          </w:tcPr>
+          <w:p>
+            <w:r>
+              <w:t>R</w:t>
+            </w:r>
+            <w:r>
+              <w:rPr>
+                <w:rFonts w:hint="eastAsia"/>
+              </w:rPr>
+              <w:t>oute</w:t>
+            </w:r>
+          </w:p>
+        </w:tc>
+        <w:tc>
+          <w:tcPr>
+            <w:tcW w:w="2926" w:type="dxa"/>
+          </w:tcPr>
+          <w:p>
+            <w:pPr>
+              <w:rPr>
+                <w:rFonts w:eastAsia="MS Mincho"/>
+              </w:rPr>
+            </w:pPr>
+            <w:r>
+              <w:t>R</w:t>
+            </w:r>
+            <w:r>
+              <w:rPr>
+                <w:rFonts w:hint="eastAsia"/>
+              </w:rPr>
+              <w:t>oute</w:t>
+            </w:r>
+          </w:p>
+        </w:tc>
+        <w:tc>
+          <w:tcPr>
+            <w:tcW w:w="3007" w:type="dxa"/>
+          </w:tcPr>
+          <w:p>
+            <w:r>
+              <w:t>A sequence of the</w:t>
+            </w:r>
+            <w:r>
+              <w:t xml:space="preserve"> actual</w:t>
+            </w:r>
+            <w:r>
+              <w:t xml:space="preserve"> transport resources</w:t>
+            </w:r>
+            <w:r>
+              <w:t xml:space="preserve"> </w:t>
+            </w:r>
+            <w:r>
+              <w:t>that support a connection</w:t>
+            </w:r>
+          </w:p>
+        </w:tc>
+      </w:tr>
+      <w:tr>
+        <w:tc>
+          <w:tcPr>
+            <w:tcW w:w="3083" w:type="dxa"/>
+          </w:tcPr>
+          <w:p>
+            <w:r>
+              <w:rPr>
+                <w:rFonts w:hint="eastAsia"/>
+              </w:rPr>
+              <w:t>P</w:t>
+            </w:r>
+            <w:r>
+              <w:t>ath</w:t>
+            </w:r>
+          </w:p>
+        </w:tc>
+        <w:tc>
+          <w:tcPr>
+            <w:tcW w:w="2926" w:type="dxa"/>
+          </w:tcPr>
+          <w:p/>
+        </w:tc>
+        <w:tc>
+          <w:tcPr>
+            <w:tcW w:w="3007" w:type="dxa"/>
+          </w:tcPr>
+          <w:p>
+            <w:r>
+              <w:t>A sequence of the</w:t>
+            </w:r>
+            <w:r>
+              <w:t xml:space="preserve"> </w:t>
+            </w:r>
+            <w:r>
+              <w:t xml:space="preserve">potential </w:t>
+            </w:r>
+            <w:r>
+              <w:t>transport resources</w:t>
+            </w:r>
+            <w:r>
+              <w:t xml:space="preserve"> in the form of links</w:t>
+            </w:r>
+            <w:r>
+              <w:t xml:space="preserve"> </w:t>
+            </w:r>
+            <w:r>
+              <w:t>that are intended to support a connection</w:t>
+            </w:r>
+          </w:p>
+        </w:tc>
+      </w:tr>
+    </w:tbl>
     <w:p/>
     <w:p>
       <w:r>
-        <w:t xml:space="preserve">&lt;add table&gt; Need to add node to own NEPs where that node may not be the same as the </w:t>
-      </w:r>
-      <w:r>
-        <w:t>base node (as an option).</w:t>
-      </w:r>
-    </w:p>
-    <w:p>
-      <w:r>
-        <w:t>To support navigation from the ASON/ASTN control plane entities and the entities more directly representing the real network resources the following properties have been added.</w:t>
-      </w:r>
-    </w:p>
-    <w:p>
-      <w:r>
-        <w:t>&lt;property indicating that this entity is in an ASON/ASTN abstraction??&gt;</w:t>
-      </w:r>
-    </w:p>
-    <w:p>
-      <w:r>
-        <w:t>&lt;relationship from each class to the supporting namespace class&gt;</w:t>
-      </w:r>
-    </w:p>
-    <w:p>
-      <w:r>
-        <w:t>&lt;property representing the relationship between link abstractions and between NEP abstractions&gt;</w:t>
+        <w:t xml:space="preserve">To support navigation from the ASON/ASTN control plane entities and the entities more directly representing the </w:t>
+      </w:r>
+      <w:r>
+        <w:t>actual</w:t>
+      </w:r>
+      <w:r>
+        <w:t xml:space="preserve"> network resources the following properties have been added.</w:t>
+      </w:r>
+    </w:p>
+    <w:p>
+      <w:pPr>
+        <w:rPr>
+          <w:b/>
+          <w:bCs/>
+          <w:color w:val="0070C0"/>
+        </w:rPr>
+      </w:pPr>
+      <w:r>
+        <w:rPr>
+          <w:b/>
+          <w:bCs/>
+          <w:color w:val="0070C0"/>
+        </w:rPr>
+        <w:lastRenderedPageBreak/>
+        <w:t>Properties related to the control plane</w:t>
+      </w:r>
+    </w:p>
+    <w:p>
+      <w:pPr>
+        <w:rPr>
+          <w:color w:val="0070C0"/>
+          <w:u w:val="single"/>
+        </w:rPr>
+      </w:pPr>
+      <w:r>
+        <w:rPr>
+          <w:color w:val="0070C0"/>
+          <w:u w:val="single"/>
+        </w:rPr>
+        <w:t>Proposal for changes to model</w:t>
+      </w:r>
+    </w:p>
+    <w:p>
+      <w:pPr>
+        <w:rPr>
+          <w:color w:val="0070C0"/>
+        </w:rPr>
+      </w:pPr>
+      <w:r>
+        <w:rPr>
+          <w:color w:val="0070C0"/>
+        </w:rPr>
+        <w:t>Add selected-path (_selectedPath [0..*]) to switch (Switch) where one path would be selected for a normal control plane case. The switch may be bidirectional if the path is always bidirectional or there may be two switches if the path direction is independently switchable. Note that this is generally applicable independent of the ASON work.</w:t>
+      </w:r>
+    </w:p>
+    <w:p>
+      <w:pPr>
+        <w:rPr>
+          <w:color w:val="0070C0"/>
+        </w:rPr>
+      </w:pPr>
+      <w:r>
+        <w:rPr>
+          <w:color w:val="0070C0"/>
+        </w:rPr>
+        <w:t xml:space="preserve">Add alternative-view </w:t>
+      </w:r>
+      <w:commentRangeStart w:id="0"/>
+      <w:r>
+        <w:rPr>
+          <w:color w:val="0070C0"/>
+        </w:rPr>
+        <w:t xml:space="preserve">(_alternativeView [0..*]) </w:t>
+      </w:r>
+      <w:commentRangeEnd w:id="0"/>
+      <w:r>
+        <w:rPr>
+          <w:rStyle w:val="CommentReference"/>
+          <w:color w:val="0070C0"/>
+        </w:rPr>
+        <w:commentReference w:id="0"/>
+      </w:r>
+      <w:r>
+        <w:rPr>
+          <w:color w:val="0070C0"/>
+        </w:rPr>
+        <w:t>to connection (Connection), node-edge-point (NodeEdgePoint), connection_end_point (ConnectionEndPoint), link (Link), service-interface-point (ServiceInterfacePoint), node (Node), connectivity-service (ConnectivityService) where this property references another entity of the same type as the entity referencing.</w:t>
+      </w:r>
+    </w:p>
+    <w:p>
+      <w:pPr>
+        <w:rPr>
+          <w:color w:val="0070C0"/>
+        </w:rPr>
+      </w:pPr>
+      <w:r>
+        <w:rPr>
+          <w:color w:val="0070C0"/>
+        </w:rPr>
+        <w:t>A property indicating that this entity is in an ASON/ASTN abstraction??</w:t>
+      </w:r>
+    </w:p>
+    <w:p>
+      <w:pPr>
+        <w:rPr>
+          <w:color w:val="0070C0"/>
+        </w:rPr>
+      </w:pPr>
+      <w:r>
+        <w:rPr>
+          <w:color w:val="0070C0"/>
+        </w:rPr>
+        <w:t>The above two could be viewpoint with role name, related viewpoint with specific pointer and role name.</w:t>
+      </w:r>
+    </w:p>
+    <w:p>
+      <w:pPr>
+        <w:rPr>
+          <w:color w:val="0070C0"/>
+        </w:rPr>
+      </w:pPr>
+      <w:r>
+        <w:rPr>
+          <w:color w:val="0070C0"/>
+        </w:rPr>
+        <w:t>Add a name (name) name and name (name) value for the control plane entities. Use generalized terminology so that it could be used for other control plane strategies.</w:t>
+      </w:r>
+    </w:p>
+    <w:p>
+      <w:pPr>
+        <w:pStyle w:val="ListParagraph"/>
+        <w:numPr>
+          <w:ilvl w:val="0"/>
+          <w:numId w:val="1"/>
+        </w:numPr>
+        <w:rPr>
+          <w:color w:val="0070C0"/>
+        </w:rPr>
+      </w:pPr>
+      <w:r>
+        <w:rPr>
+          <w:color w:val="0070C0"/>
+        </w:rPr>
+        <w:t>name: CONTROL_PLANE_ENTITY</w:t>
+      </w:r>
+    </w:p>
+    <w:p>
+      <w:pPr>
+        <w:pStyle w:val="ListParagraph"/>
+        <w:numPr>
+          <w:ilvl w:val="0"/>
+          <w:numId w:val="1"/>
+        </w:numPr>
+        <w:rPr>
+          <w:color w:val="0070C0"/>
+        </w:rPr>
+      </w:pPr>
+      <w:r>
+        <w:rPr>
+          <w:color w:val="0070C0"/>
+        </w:rPr>
+        <w:t>value: ASTN_SNP, ASTN_SNPP, ASTN_CONNECTION etc.</w:t>
+      </w:r>
+    </w:p>
+    <w:p>
+      <w:pPr>
+        <w:rPr>
+          <w:color w:val="0070C0"/>
+        </w:rPr>
+      </w:pPr>
+      <w:r>
+        <w:rPr>
+          <w:color w:val="0070C0"/>
+        </w:rPr>
+        <w:t>Where the entity is dual mode (both control plane and standard, no special name is added.</w:t>
+      </w:r>
+    </w:p>
+    <w:p>
+      <w:pPr>
+        <w:rPr>
+          <w:b/>
+        </w:rPr>
+      </w:pPr>
+      <w:r>
+        <w:rPr>
+          <w:b/>
+        </w:rPr>
+        <w:t>Scenarios</w:t>
       </w:r>
     </w:p>
     <w:p>
@@ -232,6 +1114,9 @@
       <w:r>
         <w:t xml:space="preserve"> there needs to be support for a connection hierarchies that have more than two levels, e.g., &lt;describe example of connection nesting&gt;</w:t>
       </w:r>
+      <w:r>
+        <w:t>. The TAPI model has been extended for resiliency cases to allow for multiple levels of lower connection below a top connection. A lower connect may have a further lower connection referenced. This is shown in some of the figures where the depth of connection recursion is necessary to correctly describe the protection/restoration scheme.</w:t>
+      </w:r>
     </w:p>
     <w:p>
       <w:r>
@@ -248,7 +1133,13 @@
     </w:p>
     <w:p>
       <w:r>
-        <w:t xml:space="preserve">The TAPI 2.5 model supports rudimentary control plane. It has a single namespace for both raw network resources and the resources controlled by the control plane. </w:t>
+        <w:t xml:space="preserve">The TAPI 2.5 model supports rudimentary control plane. It has a single namespace for both </w:t>
+      </w:r>
+      <w:r>
+        <w:t>actual</w:t>
+      </w:r>
+      <w:r>
+        <w:t xml:space="preserve"> network resources and the resources controlled by the control plane. </w:t>
       </w:r>
     </w:p>
     <w:p>
@@ -257,15 +1148,7 @@
         <w:t xml:space="preserve">The </w:t>
       </w:r>
       <w:r>
-        <w:t>orchestrator/</w:t>
-      </w:r>
-      <w:proofErr w:type="gramStart"/>
-      <w:r>
-        <w:t>higher-controller</w:t>
-      </w:r>
-      <w:proofErr w:type="gramEnd"/>
-      <w:r>
-        <w:t xml:space="preserve"> will not </w:t>
+        <w:t xml:space="preserve">orchestrator/higher-controller will not </w:t>
       </w:r>
       <w:r>
         <w:t xml:space="preserve">see a difference between a network where the lower controller controls the network resources directly and uses its PCE to compute paths and a network where the lower controller is essentially transparent using the control plane PCE </w:t>
@@ -279,10 +1162,19 @@
         <w:t xml:space="preserve">This solution assumes that the </w:t>
       </w:r>
       <w:r>
-        <w:t>connection controlled by the control plane is reflected directly in the normal TAPI namespace</w:t>
-      </w:r>
-      <w:r>
-        <w:t xml:space="preserve"> and that there is no resource abstraction beyond that familiar in </w:t>
+        <w:t xml:space="preserve">connection controlled by the control plane is reflected directly in the normal TAPI </w:t>
+      </w:r>
+      <w:r>
+        <w:t xml:space="preserve">actual network </w:t>
+      </w:r>
+      <w:r>
+        <w:t>namespace</w:t>
+      </w:r>
+      <w:r>
+        <w:t xml:space="preserve"> and that there is no resource abstraction beyond </w:t>
+      </w:r>
+      <w:r>
+        <w:t xml:space="preserve">that familiar in </w:t>
       </w:r>
       <w:r>
         <w:t>TAPI.</w:t>
@@ -315,19 +1207,30 @@
             <v:path o:extrusionok="f" gradientshapeok="t" o:connecttype="rect"/>
             <o:lock v:ext="edit" aspectratio="t"/>
           </v:shapetype>
-          <v:shape id="_x0000_i1025" type="#_x0000_t75" style="width:451.5pt;height:254.25pt" o:ole="">
-            <v:imagedata r:id="rId5" o:title=""/>
+          <v:shape id="_x0000_i1025" type="#_x0000_t75" style="width:452.25pt;height:254.25pt" o:ole="">
+            <v:imagedata r:id="rId12" o:title=""/>
           </v:shape>
-          <o:OLEObject Type="Embed" ProgID="PowerPoint.Slide.12" ShapeID="_x0000_i1025" DrawAspect="Content" ObjectID="_1835874168" r:id="rId6"/>
+          <o:OLEObject Type="Embed" ProgID="PowerPoint.Slide.12" ShapeID="_x0000_i1025" DrawAspect="Content" ObjectID="_1837575124" r:id="rId13"/>
         </w:object>
       </w:r>
-    </w:p>
-    <w:p>
-      <w:r>
-        <w:t>The figure below adds in the</w:t>
-      </w:r>
-      <w:r>
-        <w:t xml:space="preserve"> path constraints to the solution. This is also supported by TAPI 2.5.</w:t>
+      <w:ins w:id="1" w:author="杨三威10099490" w:date="2026-03-26T20:33:00Z">
+        <w:r>
+          <w:t>figure 1</w:t>
+        </w:r>
+      </w:ins>
+    </w:p>
+    <w:p>
+      <w:r>
+        <w:t>The figure below a</w:t>
+      </w:r>
+      <w:r>
+        <w:t>dds in the</w:t>
+      </w:r>
+      <w:r>
+        <w:t xml:space="preserve"> path constraints to the solution</w:t>
+      </w:r>
+      <w:r>
+        <w:t>. This is also supported by TAPI 2.5.</w:t>
       </w:r>
       <w:r>
         <w:t xml:space="preserve"> The selected path is additional in TAPI 2.7.</w:t>
@@ -338,12 +1241,17 @@
     <w:p>
       <w:r>
         <w:object w:dxaOrig="9599" w:dyaOrig="5400" w14:anchorId="62FD8B11">
-          <v:shape id="_x0000_i1058" type="#_x0000_t75" style="width:480pt;height:270pt" o:ole="">
-            <v:imagedata r:id="rId7" o:title=""/>
+          <v:shape id="_x0000_i1026" type="#_x0000_t75" style="width:480pt;height:270pt" o:ole="">
+            <v:imagedata r:id="rId14" o:title=""/>
           </v:shape>
-          <o:OLEObject Type="Embed" ProgID="PowerPoint.Slide.12" ShapeID="_x0000_i1058" DrawAspect="Content" ObjectID="_1835874169" r:id="rId8"/>
+          <o:OLEObject Type="Embed" ProgID="PowerPoint.Slide.12" ShapeID="_x0000_i1026" DrawAspect="Content" ObjectID="_1837575125" r:id="rId15"/>
         </w:object>
       </w:r>
+      <w:ins w:id="2" w:author="杨三威10099490" w:date="2026-03-26T20:33:00Z">
+        <w:r>
+          <w:t>figure 2</w:t>
+        </w:r>
+      </w:ins>
     </w:p>
     <w:p/>
     <w:p>
@@ -351,7 +1259,16 @@
         <w:pStyle w:val="Heading2"/>
       </w:pPr>
       <w:r>
-        <w:t>Minimal two namespace solution with no restoration constraints</w:t>
+        <w:t xml:space="preserve">Minimal </w:t>
+      </w:r>
+      <w:r>
+        <w:t>dual</w:t>
+      </w:r>
+      <w:r>
+        <w:t xml:space="preserve"> namespace</w:t>
+      </w:r>
+      <w:r>
+        <w:t xml:space="preserve"> solution with no restoration constraints</w:t>
       </w:r>
     </w:p>
     <w:p>
@@ -364,7 +1281,10 @@
     </w:p>
     <w:p>
       <w:r>
-        <w:t>In the figure below there is a</w:t>
+        <w:t>In the figure below there i</w:t>
+      </w:r>
+      <w:r>
+        <w:t>s a</w:t>
       </w:r>
       <w:r>
         <w:t>n extra connection reflecting the control plane’s representation of the connectivity</w:t>
@@ -375,7 +1295,13 @@
     </w:p>
     <w:p>
       <w:r>
-        <w:t>The connection is bounded by CEPs representing the control plane abstraction of the real CEP</w:t>
+        <w:t xml:space="preserve">The connection is bounded by CEPs representing the control plane abstraction of the </w:t>
+      </w:r>
+      <w:r>
+        <w:t>actual</w:t>
+      </w:r>
+      <w:r>
+        <w:t xml:space="preserve"> CEP</w:t>
       </w:r>
       <w:r>
         <w:t>s and these control plane CEPs (SNPs) are</w:t>
@@ -425,12 +1351,76 @@
     <w:p>
       <w:r>
         <w:object w:dxaOrig="9600" w:dyaOrig="5401" w14:anchorId="6264F694">
-          <v:shape id="_x0000_i1081" type="#_x0000_t75" style="width:480pt;height:270pt" o:ole="">
-            <v:imagedata r:id="rId9" o:title=""/>
+          <v:shape id="_x0000_i1027" type="#_x0000_t75" style="width:480pt;height:270pt" o:ole="">
+            <v:imagedata r:id="rId16" o:title=""/>
           </v:shape>
-          <o:OLEObject Type="Embed" ProgID="PowerPoint.Slide.12" ShapeID="_x0000_i1081" DrawAspect="Content" ObjectID="_1835874170" r:id="rId10"/>
+          <o:OLEObject Type="Embed" ProgID="PowerPoint.Slide.12" ShapeID="_x0000_i1027" DrawAspect="Content" ObjectID="_1837575126" r:id="rId17"/>
         </w:object>
       </w:r>
+      <w:ins w:id="3" w:author="杨三威10099490" w:date="2026-03-26T20:33:00Z">
+        <w:r>
+          <w:t>figure 3</w:t>
+        </w:r>
+      </w:ins>
+    </w:p>
+    <w:p>
+      <w:r>
+        <w:t xml:space="preserve">The figure shows a node with dashed border </w:t>
+      </w:r>
+      <w:r>
+        <w:t>above the ROADM 1 node and a similar node above ROADM 3. These are optional nodes. The control plane resources can be exposed via ROADM1 and ROADM 3 or can be exposed via</w:t>
+      </w:r>
+      <w:r>
+        <w:t xml:space="preserve"> </w:t>
+      </w:r>
+      <w:r>
+        <w:t xml:space="preserve">separate </w:t>
+      </w:r>
+      <w:r>
+        <w:t xml:space="preserve">CP1 </w:t>
+      </w:r>
+      <w:r>
+        <w:t xml:space="preserve">and </w:t>
+      </w:r>
+      <w:r>
+        <w:t>CP3</w:t>
+      </w:r>
+      <w:r>
+        <w:t xml:space="preserve"> </w:t>
+      </w:r>
+      <w:r>
+        <w:t>nodes.</w:t>
+      </w:r>
+      <w:r>
+        <w:t xml:space="preserve"> If CP1 and CP3 are represented, they can be related to the </w:t>
+      </w:r>
+      <w:r>
+        <w:t>actual</w:t>
+      </w:r>
+      <w:r>
+        <w:t xml:space="preserve"> nodes via </w:t>
+      </w:r>
+      <w:r>
+        <w:t>the corresponding view change references.</w:t>
+      </w:r>
+      <w:r>
+        <w:t xml:space="preserve"> There is no need to represent the separate </w:t>
+      </w:r>
+      <w:r>
+        <w:t xml:space="preserve">control plane </w:t>
+      </w:r>
+      <w:r>
+        <w:t xml:space="preserve">nodes if </w:t>
+      </w:r>
+      <w:r>
+        <w:t>each</w:t>
+      </w:r>
+      <w:r>
+        <w:t xml:space="preserve"> </w:t>
+      </w:r>
+      <w:r>
+        <w:t>control plane resource only represent resources that are solely within a single existing node.</w:t>
+      </w:r>
     </w:p>
     <w:p/>
     <w:p>
@@ -438,479 +1428,729 @@
         <w:pStyle w:val="Heading2"/>
       </w:pPr>
       <w:r>
-        <w:t>With simple path constraints</w:t>
-      </w:r>
+        <w:t>Dual namespace solution w</w:t>
+      </w:r>
+      <w:r>
+        <w:t>ith simple path constraints</w:t>
+      </w:r>
+    </w:p>
+    <w:p>
+      <w:r>
+        <w:t>The following figure shows a control plane call</w:t>
+      </w:r>
+      <w:r>
+        <w:t xml:space="preserve"> via BRIs</w:t>
+      </w:r>
+      <w:r>
+        <w:t xml:space="preserve"> that is realized by a connection in the </w:t>
+      </w:r>
+      <w:r>
+        <w:t xml:space="preserve">TAPI </w:t>
+      </w:r>
+      <w:r>
+        <w:t>actual</w:t>
+      </w:r>
+      <w:r>
+        <w:t xml:space="preserve"> network namespace that has normal </w:t>
+      </w:r>
+      <w:r>
+        <w:t>actual</w:t>
+      </w:r>
+      <w:r>
+        <w:t xml:space="preserve"> network </w:t>
+      </w:r>
+      <w:r>
+        <w:t>paths.</w:t>
+      </w:r>
+    </w:p>
+    <w:p/>
+    <w:commentRangeStart w:id="4"/>
+    <w:commentRangeStart w:id="5"/>
+    <w:p>
+      <w:r>
+        <w:object w:dxaOrig="9600" w:dyaOrig="5401" w14:anchorId="67914C0A">
+          <v:shape id="_x0000_i1028" type="#_x0000_t75" style="width:480pt;height:270pt" o:ole="">
+            <v:imagedata r:id="rId18" o:title=""/>
+          </v:shape>
+          <o:OLEObject Type="Embed" ProgID="PowerPoint.Slide.12" ShapeID="_x0000_i1028" DrawAspect="Content" ObjectID="_1837575127" r:id="rId19"/>
+        </w:object>
+      </w:r>
+      <w:commentRangeEnd w:id="4"/>
+      <w:r>
+        <w:rPr>
+          <w:rStyle w:val="CommentReference"/>
+        </w:rPr>
+        <w:commentReference w:id="4"/>
+      </w:r>
+      <w:commentRangeEnd w:id="5"/>
+      <w:r>
+        <w:rPr>
+          <w:rStyle w:val="CommentReference"/>
+        </w:rPr>
+        <w:commentReference w:id="5"/>
+      </w:r>
+      <w:ins w:id="6" w:author="杨三威10099490" w:date="2026-03-26T20:33:00Z">
+        <w:r>
+          <w:t>figure 4</w:t>
+        </w:r>
+      </w:ins>
+    </w:p>
+    <w:p>
+      <w:r>
+        <w:t>This is a suitable solution if the</w:t>
+      </w:r>
+      <w:r>
+        <w:t xml:space="preserve"> control plane uses raw physical resources with no abstraction</w:t>
+      </w:r>
+      <w:r>
+        <w:t>.</w:t>
+      </w:r>
+    </w:p>
+    <w:p>
+      <w:pPr>
+        <w:pStyle w:val="Heading2"/>
+      </w:pPr>
+      <w:r>
+        <w:t>Dual namespace solution w</w:t>
+      </w:r>
+      <w:r>
+        <w:t>ith path constraints and alternatives</w:t>
+      </w:r>
+    </w:p>
+    <w:p>
+      <w:pPr>
+        <w:pStyle w:val="ListParagraph"/>
+        <w:numPr>
+          <w:ilvl w:val="0"/>
+          <w:numId w:val="2"/>
+        </w:numPr>
+        <w:rPr>
+          <w:highlight w:val="yellow"/>
+        </w:rPr>
+      </w:pPr>
+      <w:r>
+        <w:rPr>
+          <w:highlight w:val="yellow"/>
+        </w:rPr>
+        <w:t>Need to add node to own NEPs where that node may not be the same as the base node (as an option).</w:t>
+      </w:r>
+    </w:p>
+    <w:p>
+      <w:r>
+        <w:t>Some control plane sol</w:t>
+      </w:r>
+      <w:r>
+        <w:t xml:space="preserve">utions allow creation of pre-panned alternative </w:t>
+      </w:r>
+      <w:r>
+        <w:t>paths.</w:t>
+      </w:r>
+      <w:r>
+        <w:t xml:space="preserve"> TAPI 2.5 provides this capability via the path</w:t>
+      </w:r>
+      <w:r>
+        <w:t xml:space="preserve"> computation service. This same service can be used to create path constraints for a control plane </w:t>
+      </w:r>
+      <w:r>
+        <w:t>solution.</w:t>
+      </w:r>
+      <w:r>
+        <w:t xml:space="preserve"> {this should be earlier in the document}}</w:t>
+      </w:r>
+    </w:p>
+    <w:p>
+      <w:r>
+        <w:t>To create a path in the control plane context the controller would use the normal method set out in UC</w:t>
+      </w:r>
+      <w:r>
+        <w:t xml:space="preserve">-xx but would provide NEPs </w:t>
+      </w:r>
+      <w:r>
+        <w:t>that are in the control plane name space.</w:t>
+      </w:r>
+    </w:p>
+    <w:p>
+      <w:ins w:id="7" w:author="杨三威10099490" w:date="2026-03-26T15:07:00Z">
+        <w:r>
+          <w:rPr>
+            <w:noProof/>
+          </w:rPr>
+          <mc:AlternateContent>
+            <mc:Choice Requires="wps">
+              <w:drawing>
+                <wp:anchor distT="0" distB="0" distL="114300" distR="114300" simplePos="0" relativeHeight="251658240" behindDoc="0" locked="0" layoutInCell="1" allowOverlap="1" wp14:anchorId="122AA61B" wp14:editId="207D1E25">
+                  <wp:simplePos x="0" y="0"/>
+                  <wp:positionH relativeFrom="column">
+                    <wp:posOffset>1951630</wp:posOffset>
+                  </wp:positionH>
+                  <wp:positionV relativeFrom="paragraph">
+                    <wp:posOffset>2135154</wp:posOffset>
+                  </wp:positionV>
+                  <wp:extent cx="565785" cy="184245"/>
+                  <wp:effectExtent l="0" t="0" r="0" b="6350"/>
+                  <wp:wrapNone/>
+                  <wp:docPr id="217" name="文本框 2"/>
+                  <wp:cNvGraphicFramePr>
+                    <a:graphicFrameLocks xmlns:a="http://schemas.openxmlformats.org/drawingml/2006/main"/>
+                  </wp:cNvGraphicFramePr>
+                  <a:graphic xmlns:a="http://schemas.openxmlformats.org/drawingml/2006/main">
+                    <a:graphicData uri="http://schemas.microsoft.com/office/word/2010/wordprocessingShape">
+                      <wps:wsp>
+                        <wps:cNvSpPr txBox="1">
+                          <a:spLocks noChangeArrowheads="1"/>
+                        </wps:cNvSpPr>
+                        <wps:spPr bwMode="auto">
+                          <a:xfrm>
+                            <a:off x="0" y="0"/>
+                            <a:ext cx="565785" cy="184245"/>
+                          </a:xfrm>
+                          <a:prstGeom prst="rect">
+                            <a:avLst/>
+                          </a:prstGeom>
+                          <a:noFill/>
+                          <a:ln w="9525">
+                            <a:noFill/>
+                            <a:miter lim="800000"/>
+                            <a:headEnd/>
+                            <a:tailEnd/>
+                          </a:ln>
+                        </wps:spPr>
+                        <wps:txbx>
+                          <w:txbxContent>
+                            <w:p>
+                              <w:pPr>
+                                <w:rPr>
+                                  <w:color w:val="FF0000"/>
+                                  <w:sz w:val="13"/>
+                                  <w:szCs w:val="13"/>
+                                  <w:rPrChange w:id="8" w:author="杨三威10099490" w:date="2026-03-26T15:08:00Z">
+                                    <w:rPr>
+                                      <w:sz w:val="13"/>
+                                      <w:szCs w:val="13"/>
+                                    </w:rPr>
+                                  </w:rPrChange>
+                                </w:rPr>
+                              </w:pPr>
+                              <w:r>
+                                <w:rPr>
+                                  <w:color w:val="FF0000"/>
+                                  <w:sz w:val="13"/>
+                                  <w:szCs w:val="13"/>
+                                  <w:rPrChange w:id="9" w:author="杨三威10099490" w:date="2026-03-26T15:08:00Z">
+                                    <w:rPr>
+                                      <w:sz w:val="13"/>
+                                      <w:szCs w:val="13"/>
+                                    </w:rPr>
+                                  </w:rPrChange>
+                                </w:rPr>
+                                <w:t>SNPPLink</w:t>
+                              </w:r>
+                            </w:p>
+                          </w:txbxContent>
+                        </wps:txbx>
+                        <wps:bodyPr rot="0" vert="horz" wrap="square" lIns="91440" tIns="45720" rIns="91440" bIns="45720" anchor="t" anchorCtr="0">
+                          <a:noAutofit/>
+                        </wps:bodyPr>
+                      </wps:wsp>
+                    </a:graphicData>
+                  </a:graphic>
+                  <wp14:sizeRelV relativeFrom="margin">
+                    <wp14:pctHeight>0</wp14:pctHeight>
+                  </wp14:sizeRelV>
+                </wp:anchor>
+              </w:drawing>
+            </mc:Choice>
+            <mc:Fallback>
+              <w:pict>
+                <v:shapetype w14:anchorId="122AA61B" id="_x0000_t202" coordsize="21600,21600" o:spt="202" path="m,l,21600r21600,l21600,xe">
+                  <v:stroke joinstyle="miter"/>
+                  <v:path gradientshapeok="t" o:connecttype="rect"/>
+                </v:shapetype>
+                <v:shape id="文本框 2" o:spid="_x0000_s1026" type="#_x0000_t202" style="position:absolute;margin-left:153.65pt;margin-top:168.1pt;width:44.55pt;height:14.5pt;z-index:251658240;visibility:visible;mso-wrap-style:square;mso-height-percent:0;mso-wrap-distance-left:9pt;mso-wrap-distance-top:0;mso-wrap-distance-right:9pt;mso-wrap-distance-bottom:0;mso-position-horizontal:absolute;mso-position-horizontal-relative:text;mso-position-vertical:absolute;mso-position-vertical-relative:text;mso-height-percent:0;mso-height-relative:margin;v-text-anchor:top" o:gfxdata="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" filled="f" stroked="f">
+                  <v:textbox>
+                    <w:txbxContent>
+                      <w:p>
+                        <w:pPr>
+                          <w:rPr>
+                            <w:color w:val="FF0000"/>
+                            <w:sz w:val="13"/>
+                            <w:szCs w:val="13"/>
+                            <w:rPrChange w:id="10" w:author="杨三威10099490" w:date="2026-03-26T15:08:00Z">
+                              <w:rPr>
+                                <w:sz w:val="13"/>
+                                <w:szCs w:val="13"/>
+                              </w:rPr>
+                            </w:rPrChange>
+                          </w:rPr>
+                        </w:pPr>
+                        <w:r>
+                          <w:rPr>
+                            <w:color w:val="FF0000"/>
+                            <w:sz w:val="13"/>
+                            <w:szCs w:val="13"/>
+                            <w:rPrChange w:id="11" w:author="杨三威10099490" w:date="2026-03-26T15:08:00Z">
+                              <w:rPr>
+                                <w:sz w:val="13"/>
+                                <w:szCs w:val="13"/>
+                              </w:rPr>
+                            </w:rPrChange>
+                          </w:rPr>
+                          <w:t>SNPPLink</w:t>
+                        </w:r>
+                      </w:p>
+                    </w:txbxContent>
+                  </v:textbox>
+                </v:shape>
+              </w:pict>
+            </mc:Fallback>
+          </mc:AlternateContent>
+        </w:r>
+      </w:ins>
+      <w:r>
+        <w:t xml:space="preserve">The figure below illustrates use of path and path-set in the context of a simple </w:t>
+      </w:r>
+      <w:r>
+        <w:t>control plane solution where there are abstractions of the core bandwidth via the partitioning and aggregati</w:t>
+      </w:r>
+      <w:r>
+        <w:t xml:space="preserve">ng the underlying network NEPs. This allows for some control of the </w:t>
+      </w:r>
+      <w:r>
+        <w:t>complex</w:t>
+      </w:r>
+      <w:r>
+        <w:t xml:space="preserve"> choice of resources when there is a need to switch pat</w:t>
+      </w:r>
+      <w:r>
+        <w:t xml:space="preserve">hs. For example, and SNPP that terminates a path </w:t>
+      </w:r>
+      <w:r>
+        <w:t xml:space="preserve">may aggregate some resources from one underlying NEP and some from another underlying NEP where the </w:t>
+      </w:r>
+      <w:r>
+        <w:t xml:space="preserve">underlying links are considered as equivalent. </w:t>
+      </w:r>
+      <w:commentRangeStart w:id="12"/>
+      <w:commentRangeStart w:id="13"/>
+      <w:r>
+        <w:rPr>
+          <w:highlight w:val="yellow"/>
+        </w:rPr>
+        <w:t>&lt;&lt;add more on this&gt;&gt;</w:t>
+      </w:r>
+      <w:commentRangeEnd w:id="12"/>
+      <w:r>
+        <w:rPr>
+          <w:rStyle w:val="CommentReference"/>
+        </w:rPr>
+        <w:commentReference w:id="12"/>
+      </w:r>
+      <w:commentRangeEnd w:id="13"/>
+      <w:r>
+        <w:rPr>
+          <w:rStyle w:val="CommentReference"/>
+        </w:rPr>
+        <w:commentReference w:id="13"/>
+      </w:r>
+      <w:r>
+        <w:br/>
+      </w:r>
+      <w:r>
+        <w:object w:dxaOrig="9571" w:dyaOrig="5384" w14:anchorId="291DE12A">
+          <v:shape id="_x0000_i1029" type="#_x0000_t75" style="width:479.25pt;height:267.75pt" o:ole="">
+            <v:imagedata r:id="rId20" o:title=""/>
+          </v:shape>
+          <o:OLEObject Type="Embed" ProgID="PowerPoint.Slide.12" ShapeID="_x0000_i1029" DrawAspect="Content" ObjectID="_1837575128" r:id="rId21"/>
+        </w:object>
+      </w:r>
+      <w:ins w:id="14" w:author="杨三威10099490" w:date="2026-03-26T20:33:00Z">
+        <w:r>
+          <w:t>figure 5</w:t>
+        </w:r>
+      </w:ins>
+    </w:p>
+    <w:p>
+      <w:pPr>
+        <w:pStyle w:val="Heading2"/>
+      </w:pPr>
+      <w:r>
+        <w:t>Dual namespace solution w</w:t>
+      </w:r>
+      <w:r>
+        <w:t>ith connection</w:t>
+      </w:r>
+      <w:r>
+        <w:t xml:space="preserve"> and path constraints</w:t>
+      </w:r>
+    </w:p>
+    <w:p>
+      <w:r>
+        <w:t>The figure below combines two previous figures</w:t>
+      </w:r>
+      <w:r>
+        <w:t>.</w:t>
+      </w:r>
+    </w:p>
+    <w:p>
+      <w:r>
+        <w:object w:dxaOrig="9599" w:dyaOrig="5400" w14:anchorId="5A724DA7">
+          <v:shape id="_x0000_i1030" type="#_x0000_t75" style="width:480pt;height:270pt" o:ole="">
+            <v:imagedata r:id="rId22" o:title=""/>
+          </v:shape>
+          <o:OLEObject Type="Embed" ProgID="PowerPoint.Slide.12" ShapeID="_x0000_i1030" DrawAspect="Content" ObjectID="_1837575129" r:id="rId23"/>
+        </w:object>
+      </w:r>
+      <w:ins w:id="15" w:author="杨三威10099490" w:date="2026-03-26T20:33:00Z">
+        <w:r>
+          <w:t>figure 6</w:t>
+        </w:r>
+      </w:ins>
+    </w:p>
+    <w:p/>
+    <w:p>
+      <w:pPr>
+        <w:pStyle w:val="Heading2"/>
+      </w:pPr>
+      <w:r>
+        <w:lastRenderedPageBreak/>
+        <w:t>Dual namespace solution w</w:t>
+      </w:r>
+      <w:r>
+        <w:t>ithout Link</w:t>
+      </w:r>
+    </w:p>
+    <w:p>
+      <w:r>
+        <w:t>The figure below shows a full control plane capability related to a</w:t>
+      </w:r>
+      <w:r>
+        <w:t xml:space="preserve">n actual network where the link is not represented. In this case the control plane links are related to the supporting top connection. </w:t>
+      </w:r>
+    </w:p>
+    <w:p>
+      <w:pPr>
+        <w:rPr>
+          <w:noProof/>
+        </w:rPr>
+      </w:pPr>
+      <w:r>
+        <w:rPr>
+          <w:noProof/>
+        </w:rPr>
+        <w:object w:dxaOrig="9600" w:dyaOrig="5401" w14:anchorId="681D5654">
+          <v:shape id="_x0000_i1044" type="#_x0000_t75" style="width:480pt;height:270pt" o:ole="">
+            <v:imagedata r:id="rId24" o:title=""/>
+          </v:shape>
+          <o:OLEObject Type="Embed" ProgID="PowerPoint.Slide.12" ShapeID="_x0000_i1044" DrawAspect="Content" ObjectID="_1837575130" r:id="rId25"/>
+        </w:object>
+      </w:r>
+      <w:ins w:id="16" w:author="杨三威10099490" w:date="2026-03-26T20:39:00Z">
+        <w:r>
+          <w:rPr>
+            <w:noProof/>
+          </w:rPr>
+          <w:t>figure 7</w:t>
+        </w:r>
+      </w:ins>
+    </w:p>
+    <w:p>
+      <w:pPr>
+        <w:rPr>
+          <w:noProof/>
+        </w:rPr>
+      </w:pPr>
+    </w:p>
+    <w:p>
+      <w:pPr>
+        <w:pStyle w:val="Heading2"/>
+        <w:rPr>
+          <w:noProof/>
+        </w:rPr>
+      </w:pPr>
+      <w:r>
+        <w:rPr>
+          <w:noProof/>
+        </w:rPr>
+        <w:lastRenderedPageBreak/>
+        <w:t>Dual namespace solution extended to transponder</w:t>
+      </w:r>
+      <w:r>
+        <w:rPr>
+          <w:noProof/>
+        </w:rPr>
+        <w:object w:dxaOrig="9599" w:dyaOrig="5400" w14:anchorId="65976506">
+          <v:shape id="_x0000_i1048" type="#_x0000_t75" style="width:480pt;height:270pt" o:ole="">
+            <v:imagedata r:id="rId26" o:title=""/>
+          </v:shape>
+          <o:OLEObject Type="Embed" ProgID="PowerPoint.Slide.12" ShapeID="_x0000_i1048" DrawAspect="Content" ObjectID="_1837575131" r:id="rId27"/>
+        </w:object>
+      </w:r>
+      <w:ins w:id="17" w:author="杨三威10099490" w:date="2026-03-26T20:40:00Z">
+        <w:r>
+          <w:rPr>
+            <w:noProof/>
+          </w:rPr>
+          <w:t>figure 8</w:t>
+        </w:r>
+      </w:ins>
+    </w:p>
+    <w:p/>
+    <w:p>
+      <w:pPr>
+        <w:pStyle w:val="Heading2"/>
+      </w:pPr>
+      <w:r>
+        <w:t>With multiple control domains</w:t>
+      </w:r>
+    </w:p>
+    <w:p>
+      <w:r>
+        <w:t xml:space="preserve">The figure below shows a connevctivity-service that </w:t>
+      </w:r>
+      <w:r>
+        <w:t>has t</w:t>
+      </w:r>
+      <w:r>
+        <w:t>wo control domains</w:t>
+      </w:r>
+      <w:r>
+        <w:t>. The outer domain is a traditional management-control domain with no control plane influence whereas the inner domain is a control plane domain. The SIPs are not related to the control plane and hence have no BRI associated. The</w:t>
+      </w:r>
+      <w:r>
+        <w:t xml:space="preserve"> connectivity-service is created </w:t>
+      </w:r>
+      <w:r>
+        <w:t xml:space="preserve">between the transponders </w:t>
+      </w:r>
+      <w:r>
+        <w:t>and the controller takes advantage of the control plane path computation/restoration capabilities</w:t>
+      </w:r>
+      <w:r>
+        <w:t xml:space="preserve">. </w:t>
+      </w:r>
+    </w:p>
+    <w:p>
+      <w:r>
+        <w:object w:dxaOrig="9599" w:dyaOrig="5400" w14:anchorId="556E6DB4">
+          <v:shape id="_x0000_i1055" type="#_x0000_t75" style="width:480pt;height:270pt" o:ole="">
+            <v:imagedata r:id="rId28" o:title=""/>
+          </v:shape>
+          <o:OLEObject Type="Embed" ProgID="PowerPoint.Slide.12" ShapeID="_x0000_i1055" DrawAspect="Content" ObjectID="_1837575132" r:id="rId29"/>
+        </w:object>
+      </w:r>
+      <w:ins w:id="18" w:author="杨三威10099490" w:date="2026-03-26T20:40:00Z">
+        <w:r>
+          <w:t>figure 9</w:t>
+        </w:r>
+      </w:ins>
     </w:p>
     <w:p/>
     <w:p/>
     <w:p>
       <w:r>
-        <w:object w:dxaOrig="9600" w:dyaOrig="5401" w14:anchorId="67914C0A">
-          <v:shape id="_x0000_i1077" type="#_x0000_t75" style="width:480pt;height:270pt" o:ole="">
-            <v:imagedata r:id="rId11" o:title=""/>
+        <w:t>Additional properties</w:t>
+      </w:r>
+    </w:p>
+    <w:p/>
+    <w:p>
+      <w:r>
+        <w:t>Multiple control planes</w:t>
+      </w:r>
+    </w:p>
+    <w:p>
+      <w:r>
+        <w:object w:dxaOrig="14174" w:dyaOrig="5400" w14:anchorId="231133D1">
+          <v:shape id="_x0000_i1034" type="#_x0000_t75" style="width:502.5pt;height:190.5pt" o:ole="">
+            <v:imagedata r:id="rId30" o:title=""/>
           </v:shape>
-          <o:OLEObject Type="Embed" ProgID="PowerPoint.Slide.12" ShapeID="_x0000_i1077" DrawAspect="Content" ObjectID="_1835874171" r:id="rId12"/>
+          <o:OLEObject Type="Embed" ProgID="PowerPoint.Slide.12" ShapeID="_x0000_i1034" DrawAspect="Content" ObjectID="_1837575133" r:id="rId31"/>
         </w:object>
       </w:r>
-    </w:p>
-    <w:p/>
+      <w:ins w:id="19" w:author="杨三威10099490" w:date="2026-03-26T20:40:00Z">
+        <w:r>
+          <w:t>figure 10</w:t>
+        </w:r>
+      </w:ins>
+    </w:p>
     <w:p>
       <w:pPr>
         <w:pStyle w:val="Heading2"/>
       </w:pPr>
       <w:r>
-        <w:lastRenderedPageBreak/>
-        <w:t>With path constraints and alternatives</w:t>
-      </w:r>
-    </w:p>
-    <w:p>
-      <w:r>
-        <w:t>Some control plane sol</w:t>
-      </w:r>
-      <w:r>
-        <w:t xml:space="preserve">utions allow creation of pre-panned alternative </w:t>
-      </w:r>
-      <w:r>
-        <w:t>paths. TAPI 2.5 provides this capability via the path</w:t>
-      </w:r>
-      <w:r>
-        <w:t xml:space="preserve"> computation service. This same service can be used to create path constraints for a control plane </w:t>
-      </w:r>
-      <w:r>
-        <w:t>solution.</w:t>
-      </w:r>
-    </w:p>
-    <w:p>
-      <w:r>
-        <w:t>To create a path in the control plane context the controller would use the normal method set out in UC</w:t>
-      </w:r>
-      <w:r>
-        <w:t xml:space="preserve">-xx but would provide NEPs </w:t>
-      </w:r>
-      <w:r>
-        <w:t>that are in the control plane name space.</w:t>
-      </w:r>
-    </w:p>
-    <w:p>
-      <w:r>
-        <w:t xml:space="preserve">The figure below illustrates use of path and path-set in the context of a simple </w:t>
-      </w:r>
-      <w:r>
-        <w:t>control plane solution where there are abstractions of the core bandwidth via the partitioning and aggregati</w:t>
-      </w:r>
-      <w:r>
-        <w:t xml:space="preserve">ng the underlying network NEPs. This allows for some control of the </w:t>
-      </w:r>
-      <w:r>
-        <w:t>complex</w:t>
-      </w:r>
-      <w:r>
-        <w:t xml:space="preserve"> choice of resources when there is a need to switch pat</w:t>
-      </w:r>
-      <w:r>
-        <w:t xml:space="preserve">hs. For example, and SNPP that terminates a path </w:t>
-      </w:r>
-      <w:r>
-        <w:t xml:space="preserve">may aggregate some resources from one underlying NEP and some from another underlying NEP where the </w:t>
-      </w:r>
-      <w:r>
-        <w:t xml:space="preserve">underlying links are considered as equivalent. </w:t>
-      </w:r>
-      <w:r>
-        <w:rPr>
-          <w:highlight w:val="yellow"/>
-        </w:rPr>
-        <w:t>&lt;&lt;add more on this&gt;&gt;</w:t>
-      </w:r>
-      <w:r>
-        <w:br/>
-      </w:r>
-      <w:r>
-        <w:object w:dxaOrig="9624" w:dyaOrig="5415" w14:anchorId="291DE12A">
-          <v:shape id="_x0000_i1082" type="#_x0000_t75" style="width:481.5pt;height:270pt" o:ole="">
-            <v:imagedata r:id="rId13" o:title=""/>
-          </v:shape>
-          <o:OLEObject Type="Embed" ProgID="PowerPoint.Slide.12" ShapeID="_x0000_i1082" DrawAspect="Content" ObjectID="_1835874172" r:id="rId14"/>
-        </w:object>
-      </w:r>
-    </w:p>
-    <w:p>
-      <w:pPr>
-        <w:pStyle w:val="Heading2"/>
-      </w:pPr>
-      <w:r>
-        <w:lastRenderedPageBreak/>
-        <w:t>With connection</w:t>
-      </w:r>
-    </w:p>
-    <w:p>
-      <w:r>
-        <w:object w:dxaOrig="9599" w:dyaOrig="5400" w14:anchorId="5A724DA7">
-          <v:shape id="_x0000_i1084" type="#_x0000_t75" style="width:480pt;height:270pt" o:ole="">
-            <v:imagedata r:id="rId15" o:title=""/>
-          </v:shape>
-          <o:OLEObject Type="Embed" ProgID="PowerPoint.Slide.12" ShapeID="_x0000_i1084" DrawAspect="Content" ObjectID="_1835874173" r:id="rId16"/>
-        </w:object>
-      </w:r>
-    </w:p>
-    <w:p/>
-    <w:p>
-      <w:pPr>
-        <w:pStyle w:val="Heading2"/>
-      </w:pPr>
-      <w:r>
-        <w:t>Without Link</w:t>
-      </w:r>
-    </w:p>
-    <w:p>
-      <w:pPr>
-        <w:rPr>
-          <w:noProof/>
-        </w:rPr>
-      </w:pPr>
-      <w:r>
-        <w:rPr>
-          <w:noProof/>
-        </w:rPr>
-        <w:object w:dxaOrig="9599" w:dyaOrig="5400" w14:anchorId="681D5654">
-          <v:shape id="_x0000_i1086" type="#_x0000_t75" style="width:480pt;height:270pt" o:ole="">
-            <v:imagedata r:id="rId17" o:title=""/>
-          </v:shape>
-          <o:OLEObject Type="Embed" ProgID="PowerPoint.Slide.12" ShapeID="_x0000_i1086" DrawAspect="Content" ObjectID="_1835874174" r:id="rId18"/>
-        </w:object>
-      </w:r>
-    </w:p>
-    <w:p>
-      <w:pPr>
-        <w:rPr>
-          <w:noProof/>
-        </w:rPr>
-      </w:pPr>
-    </w:p>
-    <w:p>
-      <w:pPr>
-        <w:pStyle w:val="Heading2"/>
-        <w:rPr>
-          <w:noProof/>
-        </w:rPr>
-      </w:pPr>
-      <w:r>
-        <w:rPr>
-          <w:noProof/>
-        </w:rPr>
-        <w:lastRenderedPageBreak/>
-        <w:t>Extending beyond</w:t>
-      </w:r>
-      <w:r>
-        <w:rPr>
-          <w:noProof/>
-        </w:rPr>
-        <w:object w:dxaOrig="9599" w:dyaOrig="5400" w14:anchorId="65976506">
-          <v:shape id="_x0000_i1088" type="#_x0000_t75" style="width:480pt;height:270pt" o:ole="">
-            <v:imagedata r:id="rId19" o:title=""/>
-          </v:shape>
-          <o:OLEObject Type="Embed" ProgID="PowerPoint.Slide.12" ShapeID="_x0000_i1088" DrawAspect="Content" ObjectID="_1835874175" r:id="rId20"/>
-        </w:object>
-      </w:r>
-    </w:p>
-    <w:p/>
-    <w:p>
-      <w:pPr>
-        <w:pStyle w:val="Heading2"/>
-      </w:pPr>
-      <w:r>
-        <w:t>With multiple control plane domains</w:t>
-      </w:r>
-    </w:p>
-    <w:p>
-      <w:r>
-        <w:object w:dxaOrig="9599" w:dyaOrig="5400" w14:anchorId="556E6DB4">
-          <v:shape id="_x0000_i1093" type="#_x0000_t75" style="width:480pt;height:270pt" o:ole="">
-            <v:imagedata r:id="rId21" o:title=""/>
-          </v:shape>
-          <o:OLEObject Type="Embed" ProgID="PowerPoint.Slide.12" ShapeID="_x0000_i1093" DrawAspect="Content" ObjectID="_1835874176" r:id="rId22"/>
-        </w:object>
+        <w:t>Control plane</w:t>
+      </w:r>
+      <w:r>
+        <w:t xml:space="preserve"> namespace</w:t>
+      </w:r>
+      <w:r>
+        <w:t xml:space="preserve"> alone</w:t>
       </w:r>
     </w:p>
     <w:p/>
     <w:p/>
     <w:p>
-      <w:r>
-        <w:t>Additional properties</w:t>
-      </w:r>
-    </w:p>
-    <w:p/>
-    <w:p>
-      <w:r>
-        <w:t>Multiple control planes</w:t>
-      </w:r>
-    </w:p>
-    <w:p>
-      <w:r>
-        <w:object w:dxaOrig="14174" w:dyaOrig="5400" w14:anchorId="231133D1">
-          <v:shape id="_x0000_i1112" type="#_x0000_t75" style="width:502.5pt;height:190.5pt" o:ole="">
-            <v:imagedata r:id="rId23" o:title=""/>
+      <w:ins w:id="20" w:author="杨三威10099490" w:date="2026-03-26T15:20:00Z">
+        <w:r>
+          <w:rPr>
+            <w:noProof/>
+          </w:rPr>
+          <mc:AlternateContent>
+            <mc:Choice Requires="wps">
+              <w:drawing>
+                <wp:anchor distT="0" distB="0" distL="114300" distR="114300" simplePos="0" relativeHeight="251660288" behindDoc="0" locked="0" layoutInCell="1" allowOverlap="1" wp14:anchorId="3AB9291E" wp14:editId="08DA256D">
+                  <wp:simplePos x="0" y="0"/>
+                  <wp:positionH relativeFrom="column">
+                    <wp:posOffset>2654490</wp:posOffset>
+                  </wp:positionH>
+                  <wp:positionV relativeFrom="paragraph">
+                    <wp:posOffset>260208</wp:posOffset>
+                  </wp:positionV>
+                  <wp:extent cx="565785" cy="184245"/>
+                  <wp:effectExtent l="0" t="0" r="0" b="6350"/>
+                  <wp:wrapNone/>
+                  <wp:docPr id="2" name="文本框 2"/>
+                  <wp:cNvGraphicFramePr>
+                    <a:graphicFrameLocks xmlns:a="http://schemas.openxmlformats.org/drawingml/2006/main"/>
+                  </wp:cNvGraphicFramePr>
+                  <a:graphic xmlns:a="http://schemas.openxmlformats.org/drawingml/2006/main">
+                    <a:graphicData uri="http://schemas.microsoft.com/office/word/2010/wordprocessingShape">
+                      <wps:wsp>
+                        <wps:cNvSpPr txBox="1">
+                          <a:spLocks noChangeArrowheads="1"/>
+                        </wps:cNvSpPr>
+                        <wps:spPr bwMode="auto">
+                          <a:xfrm>
+                            <a:off x="0" y="0"/>
+                            <a:ext cx="565785" cy="184245"/>
+                          </a:xfrm>
+                          <a:prstGeom prst="rect">
+                            <a:avLst/>
+                          </a:prstGeom>
+                          <a:noFill/>
+                          <a:ln w="9525">
+                            <a:noFill/>
+                            <a:miter lim="800000"/>
+                            <a:headEnd/>
+                            <a:tailEnd/>
+                          </a:ln>
+                        </wps:spPr>
+                        <wps:txbx>
+                          <w:txbxContent>
+                            <w:p>
+                              <w:pPr>
+                                <w:rPr>
+                                  <w:color w:val="FF0000"/>
+                                  <w:sz w:val="13"/>
+                                  <w:szCs w:val="13"/>
+                                  <w:rPrChange w:id="21" w:author="杨三威10099490" w:date="2026-03-26T15:08:00Z">
+                                    <w:rPr>
+                                      <w:sz w:val="13"/>
+                                      <w:szCs w:val="13"/>
+                                    </w:rPr>
+                                  </w:rPrChange>
+                                </w:rPr>
+                              </w:pPr>
+                              <w:ins w:id="22" w:author="杨三威10099490" w:date="2026-03-26T15:20:00Z">
+                                <w:r>
+                                  <w:rPr>
+                                    <w:color w:val="FF0000"/>
+                                    <w:sz w:val="13"/>
+                                    <w:szCs w:val="13"/>
+                                  </w:rPr>
+                                  <w:t>Call</w:t>
+                                </w:r>
+                              </w:ins>
+                            </w:p>
+                          </w:txbxContent>
+                        </wps:txbx>
+                        <wps:bodyPr rot="0" vert="horz" wrap="square" lIns="91440" tIns="45720" rIns="91440" bIns="45720" anchor="t" anchorCtr="0">
+                          <a:noAutofit/>
+                        </wps:bodyPr>
+                      </wps:wsp>
+                    </a:graphicData>
+                  </a:graphic>
+                  <wp14:sizeRelV relativeFrom="margin">
+                    <wp14:pctHeight>0</wp14:pctHeight>
+                  </wp14:sizeRelV>
+                </wp:anchor>
+              </w:drawing>
+            </mc:Choice>
+            <mc:Fallback>
+              <w:pict>
+                <v:shape w14:anchorId="3AB9291E" id="_x0000_s1027" type="#_x0000_t202" style="position:absolute;margin-left:209pt;margin-top:20.5pt;width:44.55pt;height:14.5pt;z-index:251660288;visibility:visible;mso-wrap-style:square;mso-height-percent:0;mso-wrap-distance-left:9pt;mso-wrap-distance-top:0;mso-wrap-distance-right:9pt;mso-wrap-distance-bottom:0;mso-position-horizontal:absolute;mso-position-horizontal-relative:text;mso-position-vertical:absolute;mso-position-vertical-relative:text;mso-height-percent:0;mso-height-relative:margin;v-text-anchor:top" o:gfxdata="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" filled="f" stroked="f">
+                  <v:textbox>
+                    <w:txbxContent>
+                      <w:p>
+                        <w:pPr>
+                          <w:rPr>
+                            <w:color w:val="FF0000"/>
+                            <w:sz w:val="13"/>
+                            <w:szCs w:val="13"/>
+                            <w:rPrChange w:id="23" w:author="杨三威10099490" w:date="2026-03-26T15:08:00Z">
+                              <w:rPr>
+                                <w:sz w:val="13"/>
+                                <w:szCs w:val="13"/>
+                              </w:rPr>
+                            </w:rPrChange>
+                          </w:rPr>
+                        </w:pPr>
+                        <w:ins w:id="24" w:author="杨三威10099490" w:date="2026-03-26T15:20:00Z">
+                          <w:r>
+                            <w:rPr>
+                              <w:color w:val="FF0000"/>
+                              <w:sz w:val="13"/>
+                              <w:szCs w:val="13"/>
+                            </w:rPr>
+                            <w:t>Call</w:t>
+                          </w:r>
+                        </w:ins>
+                      </w:p>
+                    </w:txbxContent>
+                  </v:textbox>
+                </v:shape>
+              </w:pict>
+            </mc:Fallback>
+          </mc:AlternateContent>
+        </w:r>
+      </w:ins>
+    </w:p>
+    <w:commentRangeStart w:id="25"/>
+    <w:commentRangeStart w:id="26"/>
+    <w:p>
+      <w:r>
+        <w:object w:dxaOrig="9599" w:dyaOrig="5400" w14:anchorId="676B6E46">
+          <v:shape id="_x0000_i1035" type="#_x0000_t75" style="width:452.25pt;height:253.5pt" o:ole="">
+            <v:imagedata r:id="rId32" o:title=""/>
           </v:shape>
-          <o:OLEObject Type="Embed" ProgID="PowerPoint.Slide.12" ShapeID="_x0000_i1112" DrawAspect="Content" ObjectID="_1835874177" r:id="rId24"/>
+          <o:OLEObject Type="Embed" ProgID="PowerPoint.Slide.12" ShapeID="_x0000_i1035" DrawAspect="Content" ObjectID="_1837575134" r:id="rId33"/>
         </w:object>
       </w:r>
-    </w:p>
-    <w:p>
-      <w:pPr>
-        <w:pStyle w:val="Heading2"/>
-      </w:pPr>
-      <w:r>
-        <w:t>C</w:t>
-      </w:r>
-      <w:r>
-        <w:t xml:space="preserve">ontrol plane </w:t>
-      </w:r>
-      <w:r>
-        <w:t>alone</w:t>
-      </w:r>
+      <w:commentRangeEnd w:id="25"/>
+      <w:r>
+        <w:rPr>
+          <w:rStyle w:val="CommentReference"/>
+        </w:rPr>
+        <w:commentReference w:id="25"/>
+      </w:r>
+      <w:commentRangeEnd w:id="26"/>
+      <w:r>
+        <w:rPr>
+          <w:rStyle w:val="CommentReference"/>
+        </w:rPr>
+        <w:commentReference w:id="26"/>
+      </w:r>
+      <w:ins w:id="27" w:author="杨三威10099490" w:date="2026-03-26T20:40:00Z">
+        <w:r>
+          <w:t>figure 11</w:t>
+        </w:r>
+      </w:ins>
     </w:p>
     <w:p/>
     <w:p/>
     <w:p/>
     <w:p>
       <w:r>
-        <w:object w:dxaOrig="9599" w:dyaOrig="5400" w14:anchorId="676B6E46">
-          <v:shape id="_x0000_i1039" type="#_x0000_t75" style="width:451.5pt;height:253.5pt" o:ole="">
-            <v:imagedata r:id="rId25" o:title=""/>
-          </v:shape>
-          <o:OLEObject Type="Embed" ProgID="PowerPoint.Slide.12" ShapeID="_x0000_i1039" DrawAspect="Content" ObjectID="_1835874178" r:id="rId26"/>
-        </w:object>
-      </w:r>
-    </w:p>
-    <w:p/>
-    <w:p/>
-    <w:p/>
-    <w:p>
-      <w:r>
-        <w:lastRenderedPageBreak/>
         <w:br w:type="page"/>
-      </w:r>
-    </w:p>
-    <w:p>
-      <w:pPr>
-        <w:rPr>
-          <w:b/>
-          <w:bCs/>
-        </w:rPr>
-      </w:pPr>
-      <w:r>
-        <w:rPr>
-          <w:b/>
-          <w:bCs/>
-        </w:rPr>
-        <w:lastRenderedPageBreak/>
-        <w:t>Proposal for changes to model</w:t>
-      </w:r>
-    </w:p>
-    <w:p/>
-    <w:p>
-      <w:r>
-        <w:t xml:space="preserve">Add </w:t>
-      </w:r>
-      <w:proofErr w:type="gramStart"/>
-      <w:r>
-        <w:t>selected</w:t>
-      </w:r>
-      <w:r>
-        <w:t>-path</w:t>
-      </w:r>
-      <w:proofErr w:type="gramEnd"/>
-      <w:r>
-        <w:t xml:space="preserve"> (_</w:t>
-      </w:r>
-      <w:proofErr w:type="spellStart"/>
-      <w:r>
-        <w:t>selectedPath</w:t>
-      </w:r>
-      <w:proofErr w:type="spellEnd"/>
-      <w:r>
-        <w:t xml:space="preserve"> [</w:t>
-      </w:r>
-      <w:proofErr w:type="gramStart"/>
-      <w:r>
-        <w:t>0..</w:t>
-      </w:r>
-      <w:proofErr w:type="gramEnd"/>
-      <w:r>
-        <w:t>*]</w:t>
-      </w:r>
-      <w:r>
-        <w:t>) to switch (Switch)</w:t>
-      </w:r>
-      <w:r>
-        <w:t xml:space="preserve"> where one path would be selected for a normal control plane case</w:t>
-      </w:r>
-      <w:r>
-        <w:t>.</w:t>
-      </w:r>
-      <w:r>
-        <w:t xml:space="preserve"> The switch may be bidirectional if the path is always bidirectional or there may be two switches if the path </w:t>
-      </w:r>
-      <w:r>
-        <w:t>direction is independently switchable.</w:t>
-      </w:r>
-      <w:r>
-        <w:t xml:space="preserve"> Note that this is generally applicable independent of the ASON work.</w:t>
-      </w:r>
-    </w:p>
-    <w:p>
-      <w:r>
-        <w:t xml:space="preserve">Add </w:t>
-      </w:r>
-      <w:r>
-        <w:t>alternative-view (_</w:t>
-      </w:r>
-      <w:proofErr w:type="spellStart"/>
-      <w:r>
-        <w:t>alternativeView</w:t>
-      </w:r>
-      <w:proofErr w:type="spellEnd"/>
-      <w:r>
-        <w:t xml:space="preserve"> [</w:t>
-      </w:r>
-      <w:proofErr w:type="gramStart"/>
-      <w:r>
-        <w:t>0..</w:t>
-      </w:r>
-      <w:proofErr w:type="gramEnd"/>
-      <w:r>
-        <w:t>*]) to connection (Connection), node-edge-point (</w:t>
-      </w:r>
-      <w:proofErr w:type="spellStart"/>
-      <w:r>
-        <w:t>NodeEdgePoint</w:t>
-      </w:r>
-      <w:proofErr w:type="spellEnd"/>
-      <w:r>
-        <w:t xml:space="preserve">), </w:t>
-      </w:r>
-      <w:proofErr w:type="spellStart"/>
-      <w:r>
-        <w:t>connection_end_point</w:t>
-      </w:r>
-      <w:proofErr w:type="spellEnd"/>
-      <w:r>
-        <w:t xml:space="preserve"> (</w:t>
-      </w:r>
-      <w:proofErr w:type="spellStart"/>
-      <w:r>
-        <w:t>ConnectionEndPoint</w:t>
-      </w:r>
-      <w:proofErr w:type="spellEnd"/>
-      <w:r>
-        <w:t>), link (Link)</w:t>
-      </w:r>
-      <w:r>
-        <w:t>, service-interface-point (</w:t>
-      </w:r>
-      <w:proofErr w:type="spellStart"/>
-      <w:r>
-        <w:t>ServiceInterfacePoint</w:t>
-      </w:r>
-      <w:proofErr w:type="spellEnd"/>
-      <w:r>
-        <w:t>)</w:t>
-      </w:r>
-      <w:r>
-        <w:t>, node (Node)</w:t>
-      </w:r>
-      <w:r>
-        <w:t>, connectivity-service</w:t>
-      </w:r>
-      <w:r>
-        <w:t xml:space="preserve"> (</w:t>
-      </w:r>
-      <w:proofErr w:type="spellStart"/>
-      <w:r>
-        <w:t>ConnectivityService</w:t>
-      </w:r>
-      <w:proofErr w:type="spellEnd"/>
-      <w:r>
-        <w:t>)</w:t>
-      </w:r>
-      <w:r>
-        <w:t xml:space="preserve"> where this property references another entity of the same type as the entity referencing.</w:t>
-      </w:r>
-    </w:p>
-    <w:p>
-      <w:r>
-        <w:t xml:space="preserve">Add a name </w:t>
-      </w:r>
-      <w:r>
-        <w:t xml:space="preserve">(name) name and name (name) value for the control plane entities. Use generalized terminology </w:t>
-      </w:r>
-      <w:r>
-        <w:t>so that it could be used for other control plane strategies.</w:t>
-      </w:r>
-    </w:p>
-    <w:p>
-      <w:pPr>
-        <w:pStyle w:val="ListParagraph"/>
-        <w:numPr>
-          <w:ilvl w:val="0"/>
-          <w:numId w:val="1"/>
-        </w:numPr>
-      </w:pPr>
-      <w:r>
-        <w:t xml:space="preserve">name: </w:t>
-      </w:r>
-      <w:r>
-        <w:t>CONTROL_PLANE_ENTITY</w:t>
-      </w:r>
-    </w:p>
-    <w:p>
-      <w:pPr>
-        <w:pStyle w:val="ListParagraph"/>
-        <w:numPr>
-          <w:ilvl w:val="0"/>
-          <w:numId w:val="1"/>
-        </w:numPr>
-      </w:pPr>
-      <w:r>
-        <w:t>value: ASTN</w:t>
-      </w:r>
-      <w:r>
-        <w:t>_SNP, ASTN_SNPP, ASTN_CONNECTION</w:t>
-      </w:r>
-      <w:r>
-        <w:t xml:space="preserve"> etc.</w:t>
-      </w:r>
-    </w:p>
-    <w:p>
-      <w:r>
-        <w:t xml:space="preserve">Where the entity is dual mode (both control plane and </w:t>
-      </w:r>
-      <w:r>
-        <w:t>standard, no special name is added.</w:t>
-      </w:r>
-    </w:p>
-    <w:p>
-      <w:r>
-        <w:t xml:space="preserve">The complex control plane cases have multiple levels of connection. There were alternative proposals for </w:t>
-      </w:r>
-      <w:proofErr w:type="gramStart"/>
-      <w:r>
-        <w:t>this</w:t>
-      </w:r>
-      <w:proofErr w:type="gramEnd"/>
-      <w:r>
-        <w:t xml:space="preserve"> but they </w:t>
-      </w:r>
-      <w:r>
-        <w:t xml:space="preserve">bent the </w:t>
-      </w:r>
-      <w:proofErr w:type="gramStart"/>
-      <w:r>
-        <w:t>two level</w:t>
-      </w:r>
-      <w:proofErr w:type="gramEnd"/>
-      <w:r>
-        <w:t xml:space="preserve"> model to sort of fit a multi-level case.</w:t>
       </w:r>
     </w:p>
     <w:sectPr>
@@ -923,9 +2163,582 @@
 </w:document>
 </file>
 
+<file path=word/comments.xml><?xml version="1.0" encoding="utf-8"?>
+<w:comments xmlns:wpc="http://schemas.microsoft.com/office/word/2010/wordprocessingCanvas" xmlns:cx="http://schemas.microsoft.com/office/drawing/2014/chartex" xmlns:cx1="http://schemas.microsoft.com/office/drawing/2015/9/8/chartex" xmlns:cx2="http://schemas.microsoft.com/office/drawing/2015/10/21/chartex" xmlns:cx3="http://schemas.microsoft.com/office/drawing/2016/5/9/chartex" xmlns:cx4="http://schemas.microsoft.com/office/drawing/2016/5/10/chartex" xmlns:cx5="http://schemas.microsoft.com/office/drawing/2016/5/11/chartex" xmlns:cx6="http://schemas.microsoft.com/office/drawing/2016/5/12/chartex" xmlns:cx7="http://schemas.microsoft.com/office/drawing/2016/5/13/chartex" xmlns:cx8="http://schemas.microsoft.com/office/drawing/2016/5/14/chartex" xmlns:mc="http://schemas.openxmlformats.org/markup-compatibility/2006" xmlns:aink="http://schemas.microsoft.com/office/drawing/2016/ink" xmlns:am3d="http://schemas.microsoft.com/office/drawing/2017/model3d" xmlns:o="urn:schemas-microsoft-com:office:office" xmlns:oel="http://schemas.microsoft.com/office/2019/extlst" xmlns:r="http://schemas.openxmlformats.org/officeDocument/2006/relationships" xmlns:m="http://schemas.openxmlformats.org/officeDocument/2006/math" xmlns:v="urn:schemas-microsoft-com:vml" xmlns:wp14="http://schemas.microsoft.com/office/word/2010/wordprocessingDrawing" xmlns:wp="http://schemas.openxmlformats.org/drawingml/2006/wordprocessingDrawing" xmlns:w10="urn:schemas-microsoft-com:office:word" xmlns:w="http://schemas.openxmlformats.org/wordprocessingml/2006/main" xmlns:w14="http://schemas.microsoft.com/office/word/2010/wordml" xmlns:w15="http://schemas.microsoft.com/office/word/2012/wordml" xmlns:w16cex="http://schemas.microsoft.com/office/word/2018/wordml/cex" xmlns:w16cid="http://schemas.microsoft.com/office/word/2016/wordml/cid" xmlns:w16="http://schemas.microsoft.com/office/word/2018/wordml" xmlns:w16du="http://schemas.microsoft.com/office/word/2023/wordml/word16du" xmlns:w16sdtdh="http://schemas.microsoft.com/office/word/2020/wordml/sdtdatahash" xmlns:w16sdtfl="http://schemas.microsoft.com/office/word/2024/wordml/sdtformatlock" xmlns:w16se="http://schemas.microsoft.com/office/word/2015/wordml/symex" xmlns:wpg="http://schemas.microsoft.com/office/word/2010/wordprocessingGroup" xmlns:wpi="http://schemas.microsoft.com/office/word/2010/wordprocessingInk" xmlns:wne="http://schemas.microsoft.com/office/word/2006/wordml" xmlns:wps="http://schemas.microsoft.com/office/word/2010/wordprocessingShape" mc:Ignorable="w14 w15 w16se w16cid w16 w16cex w16sdtdh w16sdtfl w16du wp14">
+  <w:comment w:id="0" w:author="Davis, Nigel" w:date="2026-03-31T10:54:00Z" w:initials="ND">
+    <w:p>
+      <w:pPr>
+        <w:pStyle w:val="CommentText"/>
+      </w:pPr>
+      <w:r>
+        <w:rPr>
+          <w:rStyle w:val="CommentReference"/>
+        </w:rPr>
+        <w:annotationRef/>
+      </w:r>
+      <w:r>
+        <w:t>May want to add view role and make this a more complex attribute. So ASON would point to real resources (but not the other way round).</w:t>
+      </w:r>
+    </w:p>
+  </w:comment>
+  <w:comment w:id="4" w:author="杨三威10099490" w:date="2026-03-26T20:28:00Z" w:initials="杨三威100994">
+    <w:p>
+      <w:pPr>
+        <w:pStyle w:val="CommentText"/>
+      </w:pPr>
+      <w:r>
+        <w:rPr>
+          <w:rStyle w:val="CommentReference"/>
+          <w:rFonts w:hint="eastAsia"/>
+        </w:rPr>
+        <w:annotationRef/>
+      </w:r>
+      <w:r>
+        <w:rPr>
+          <w:rFonts w:hint="eastAsia"/>
+        </w:rPr>
+        <w:t>What</w:t>
+      </w:r>
+      <w:r>
+        <w:t>’</w:t>
+      </w:r>
+      <w:r>
+        <w:rPr>
+          <w:rFonts w:hint="eastAsia"/>
+        </w:rPr>
+        <w:t>s</w:t>
+      </w:r>
+      <w:r>
+        <w:t xml:space="preserve"> the difference between the 2th figure</w:t>
+      </w:r>
+      <w:r>
+        <w:rPr>
+          <w:rFonts w:hint="eastAsia"/>
+          <w:lang w:eastAsia="zh-CN"/>
+        </w:rPr>
+        <w:t>?</w:t>
+      </w:r>
+      <w:r>
+        <w:rPr>
+          <w:lang w:eastAsia="zh-CN"/>
+        </w:rPr>
+        <w:t xml:space="preserve"> </w:t>
+      </w:r>
+      <w:r>
+        <w:rPr>
+          <w:rFonts w:hint="eastAsia"/>
+          <w:lang w:eastAsia="zh-CN"/>
+        </w:rPr>
+        <w:t>S</w:t>
+      </w:r>
+      <w:r>
+        <w:rPr>
+          <w:lang w:eastAsia="zh-CN"/>
+        </w:rPr>
+        <w:t>hall we add some description here.</w:t>
+      </w:r>
+    </w:p>
+  </w:comment>
+  <w:comment w:id="5" w:author="Davis, Nigel" w:date="2026-03-31T10:59:00Z" w:initials="ND">
+    <w:p>
+      <w:pPr>
+        <w:pStyle w:val="CommentText"/>
+      </w:pPr>
+      <w:r>
+        <w:rPr>
+          <w:rStyle w:val="CommentReference"/>
+        </w:rPr>
+        <w:annotationRef/>
+      </w:r>
+      <w:r>
+        <w:t>I will add description throughout.</w:t>
+      </w:r>
+    </w:p>
+  </w:comment>
+  <w:comment w:id="12" w:author="杨三威10099490" w:date="2026-03-26T15:48:00Z" w:initials="杨三威100994">
+    <w:p>
+      <w:pPr>
+        <w:pStyle w:val="CommentText"/>
+        <w:rPr>
+          <w:lang w:eastAsia="zh-CN"/>
+        </w:rPr>
+      </w:pPr>
+      <w:r>
+        <w:rPr>
+          <w:rStyle w:val="CommentReference"/>
+          <w:rFonts w:hint="eastAsia"/>
+        </w:rPr>
+        <w:annotationRef/>
+      </w:r>
+      <w:r>
+        <w:rPr>
+          <w:lang w:eastAsia="zh-CN"/>
+        </w:rPr>
+        <w:t>Some de</w:t>
+      </w:r>
+      <w:r>
+        <w:rPr>
+          <w:lang w:eastAsia="zh-CN"/>
+        </w:rPr>
+        <w:t>s</w:t>
+      </w:r>
+      <w:r>
+        <w:rPr>
+          <w:lang w:eastAsia="zh-CN"/>
+        </w:rPr>
+        <w:t>cription of link aggregation in ITU-T</w:t>
+      </w:r>
+      <w:r>
+        <w:rPr>
+          <w:lang w:eastAsia="zh-CN"/>
+        </w:rPr>
+        <w:t xml:space="preserve"> G.7701 and G.805.</w:t>
+      </w:r>
+    </w:p>
+    <w:p>
+      <w:pPr>
+        <w:pStyle w:val="CommentText"/>
+      </w:pPr>
+      <w:r>
+        <w:rPr>
+          <w:noProof/>
+          <w:lang w:val="en-US" w:eastAsia="zh-CN"/>
+        </w:rPr>
+        <w:drawing>
+          <wp:inline distT="0" distB="0" distL="0" distR="0" wp14:anchorId="075C7553" wp14:editId="60C4ADCE">
+            <wp:extent cx="3970007" cy="1560117"/>
+            <wp:effectExtent l="0" t="0" r="0" b="2540"/>
+            <wp:docPr id="3" name="图片 3"/>
+            <wp:cNvGraphicFramePr>
+              <a:graphicFrameLocks xmlns:a="http://schemas.openxmlformats.org/drawingml/2006/main" noChangeAspect="1"/>
+            </wp:cNvGraphicFramePr>
+            <a:graphic xmlns:a="http://schemas.openxmlformats.org/drawingml/2006/main">
+              <a:graphicData uri="http://schemas.openxmlformats.org/drawingml/2006/picture">
+                <pic:pic xmlns:pic="http://schemas.openxmlformats.org/drawingml/2006/picture">
+                  <pic:nvPicPr>
+                    <pic:cNvPr id="1" name=""/>
+                    <pic:cNvPicPr/>
+                  </pic:nvPicPr>
+                  <pic:blipFill>
+                    <a:blip r:embed="rId1"/>
+                    <a:stretch>
+                      <a:fillRect/>
+                    </a:stretch>
+                  </pic:blipFill>
+                  <pic:spPr>
+                    <a:xfrm>
+                      <a:off x="0" y="0"/>
+                      <a:ext cx="3975539" cy="1562291"/>
+                    </a:xfrm>
+                    <a:prstGeom prst="rect">
+                      <a:avLst/>
+                    </a:prstGeom>
+                  </pic:spPr>
+                </pic:pic>
+              </a:graphicData>
+            </a:graphic>
+          </wp:inline>
+        </w:drawing>
+      </w:r>
+    </w:p>
+    <w:p>
+      <w:pPr>
+        <w:pStyle w:val="CommentText"/>
+      </w:pPr>
+      <w:r>
+        <w:rPr>
+          <w:noProof/>
+          <w:lang w:val="en-US" w:eastAsia="zh-CN"/>
+        </w:rPr>
+        <w:drawing>
+          <wp:inline distT="0" distB="0" distL="0" distR="0" wp14:anchorId="4B777A10" wp14:editId="04E7421C">
+            <wp:extent cx="4298078" cy="2997607"/>
+            <wp:effectExtent l="0" t="0" r="7620" b="0"/>
+            <wp:docPr id="1" name="图片 1"/>
+            <wp:cNvGraphicFramePr>
+              <a:graphicFrameLocks xmlns:a="http://schemas.openxmlformats.org/drawingml/2006/main" noChangeAspect="1"/>
+            </wp:cNvGraphicFramePr>
+            <a:graphic xmlns:a="http://schemas.openxmlformats.org/drawingml/2006/main">
+              <a:graphicData uri="http://schemas.openxmlformats.org/drawingml/2006/picture">
+                <pic:pic xmlns:pic="http://schemas.openxmlformats.org/drawingml/2006/picture">
+                  <pic:nvPicPr>
+                    <pic:cNvPr id="1" name=""/>
+                    <pic:cNvPicPr/>
+                  </pic:nvPicPr>
+                  <pic:blipFill>
+                    <a:blip r:embed="rId2"/>
+                    <a:stretch>
+                      <a:fillRect/>
+                    </a:stretch>
+                  </pic:blipFill>
+                  <pic:spPr>
+                    <a:xfrm>
+                      <a:off x="0" y="0"/>
+                      <a:ext cx="4300542" cy="2999325"/>
+                    </a:xfrm>
+                    <a:prstGeom prst="rect">
+                      <a:avLst/>
+                    </a:prstGeom>
+                  </pic:spPr>
+                </pic:pic>
+              </a:graphicData>
+            </a:graphic>
+          </wp:inline>
+        </w:drawing>
+      </w:r>
+    </w:p>
+    <w:p>
+      <w:pPr>
+        <w:pStyle w:val="CommentText"/>
+      </w:pPr>
+      <w:r>
+        <w:rPr>
+          <w:noProof/>
+          <w:lang w:val="en-US" w:eastAsia="zh-CN"/>
+        </w:rPr>
+        <w:drawing>
+          <wp:inline distT="0" distB="0" distL="0" distR="0" wp14:anchorId="2FC6E10E" wp14:editId="42AABDFD">
+            <wp:extent cx="3582000" cy="3427200"/>
+            <wp:effectExtent l="0" t="0" r="0" b="1905"/>
+            <wp:docPr id="4" name="图片 4"/>
+            <wp:cNvGraphicFramePr>
+              <a:graphicFrameLocks xmlns:a="http://schemas.openxmlformats.org/drawingml/2006/main" noChangeAspect="1"/>
+            </wp:cNvGraphicFramePr>
+            <a:graphic xmlns:a="http://schemas.openxmlformats.org/drawingml/2006/main">
+              <a:graphicData uri="http://schemas.openxmlformats.org/drawingml/2006/picture">
+                <pic:pic xmlns:pic="http://schemas.openxmlformats.org/drawingml/2006/picture">
+                  <pic:nvPicPr>
+                    <pic:cNvPr id="1" name=""/>
+                    <pic:cNvPicPr/>
+                  </pic:nvPicPr>
+                  <pic:blipFill>
+                    <a:blip r:embed="rId3"/>
+                    <a:stretch>
+                      <a:fillRect/>
+                    </a:stretch>
+                  </pic:blipFill>
+                  <pic:spPr>
+                    <a:xfrm>
+                      <a:off x="0" y="0"/>
+                      <a:ext cx="3582000" cy="3427200"/>
+                    </a:xfrm>
+                    <a:prstGeom prst="rect">
+                      <a:avLst/>
+                    </a:prstGeom>
+                  </pic:spPr>
+                </pic:pic>
+              </a:graphicData>
+            </a:graphic>
+          </wp:inline>
+        </w:drawing>
+      </w:r>
+    </w:p>
+  </w:comment>
+  <w:comment w:id="13" w:author="Davis, Nigel" w:date="2026-03-31T10:59:00Z" w:initials="ND">
+    <w:p>
+      <w:pPr>
+        <w:pStyle w:val="CommentText"/>
+      </w:pPr>
+      <w:r>
+        <w:rPr>
+          <w:rStyle w:val="CommentReference"/>
+        </w:rPr>
+        <w:annotationRef/>
+      </w:r>
+      <w:r>
+        <w:t>Will work this into the descriptions</w:t>
+      </w:r>
+    </w:p>
+  </w:comment>
+  <w:comment w:id="25" w:author="杨三威10099490" w:date="2026-03-26T15:21:00Z" w:initials="杨三威100994">
+    <w:p>
+      <w:pPr>
+        <w:pStyle w:val="CommentText"/>
+        <w:rPr>
+          <w:lang w:eastAsia="zh-CN"/>
+        </w:rPr>
+      </w:pPr>
+      <w:r>
+        <w:rPr>
+          <w:rStyle w:val="CommentReference"/>
+          <w:rFonts w:hint="eastAsia"/>
+        </w:rPr>
+        <w:annotationRef/>
+      </w:r>
+      <w:r>
+        <w:rPr>
+          <w:rFonts w:hint="eastAsia"/>
+          <w:lang w:eastAsia="zh-CN"/>
+        </w:rPr>
+        <w:t>D</w:t>
+      </w:r>
+      <w:r>
+        <w:rPr>
+          <w:lang w:eastAsia="zh-CN"/>
+        </w:rPr>
+        <w:t>elete the proposal</w:t>
+      </w:r>
+      <w:r>
+        <w:rPr>
+          <w:rFonts w:hint="eastAsia"/>
+          <w:lang w:eastAsia="zh-CN"/>
+        </w:rPr>
+        <w:t>?</w:t>
+      </w:r>
+    </w:p>
+    <w:p>
+      <w:pPr>
+        <w:pStyle w:val="CommentText"/>
+        <w:rPr>
+          <w:lang w:eastAsia="zh-CN"/>
+        </w:rPr>
+      </w:pPr>
+      <w:r>
+        <w:rPr>
+          <w:rFonts w:hint="eastAsia"/>
+          <w:lang w:eastAsia="zh-CN"/>
+        </w:rPr>
+        <w:t>C</w:t>
+      </w:r>
+      <w:r>
+        <w:rPr>
+          <w:lang w:eastAsia="zh-CN"/>
+        </w:rPr>
+        <w:t>ompared to figure 2</w:t>
+      </w:r>
+      <w:r>
+        <w:rPr>
+          <w:rFonts w:hint="eastAsia"/>
+          <w:lang w:eastAsia="zh-CN"/>
+        </w:rPr>
+        <w:t>,</w:t>
+      </w:r>
+      <w:r>
+        <w:rPr>
+          <w:lang w:eastAsia="zh-CN"/>
+        </w:rPr>
+        <w:t xml:space="preserve"> path and path set could be in one namespace and two namespace?</w:t>
+      </w:r>
+    </w:p>
+  </w:comment>
+  <w:comment w:id="26" w:author="Davis, Nigel" w:date="2026-03-31T11:01:00Z" w:initials="ND">
+    <w:p>
+      <w:pPr>
+        <w:pStyle w:val="CommentText"/>
+      </w:pPr>
+      <w:r>
+        <w:rPr>
+          <w:rStyle w:val="CommentReference"/>
+        </w:rPr>
+        <w:annotationRef/>
+      </w:r>
+      <w:r>
+        <w:t>I need to clarify the figure.</w:t>
+      </w:r>
+    </w:p>
+  </w:comment>
+</w:comments>
+</file>
+
+<file path=word/commentsExtended.xml><?xml version="1.0" encoding="utf-8"?>
+<w15:commentsEx xmlns:wpc="http://schemas.microsoft.com/office/word/2010/wordprocessingCanvas" xmlns:cx="http://schemas.microsoft.com/office/drawing/2014/chartex" xmlns:cx1="http://schemas.microsoft.com/office/drawing/2015/9/8/chartex" xmlns:cx2="http://schemas.microsoft.com/office/drawing/2015/10/21/chartex" xmlns:cx3="http://schemas.microsoft.com/office/drawing/2016/5/9/chartex" xmlns:cx4="http://schemas.microsoft.com/office/drawing/2016/5/10/chartex" xmlns:cx5="http://schemas.microsoft.com/office/drawing/2016/5/11/chartex" xmlns:cx6="http://schemas.microsoft.com/office/drawing/2016/5/12/chartex" xmlns:cx7="http://schemas.microsoft.com/office/drawing/2016/5/13/chartex" xmlns:cx8="http://schemas.microsoft.com/office/drawing/2016/5/14/chartex" xmlns:mc="http://schemas.openxmlformats.org/markup-compatibility/2006" xmlns:aink="http://schemas.microsoft.com/office/drawing/2016/ink" xmlns:am3d="http://schemas.microsoft.com/office/drawing/2017/model3d" xmlns:o="urn:schemas-microsoft-com:office:office" xmlns:oel="http://schemas.microsoft.com/office/2019/extlst" xmlns:r="http://schemas.openxmlformats.org/officeDocument/2006/relationships" xmlns:m="http://schemas.openxmlformats.org/officeDocument/2006/math" xmlns:v="urn:schemas-microsoft-com:vml" xmlns:wp14="http://schemas.microsoft.com/office/word/2010/wordprocessingDrawing" xmlns:wp="http://schemas.openxmlformats.org/drawingml/2006/wordprocessingDrawing" xmlns:w10="urn:schemas-microsoft-com:office:word" xmlns:w="http://schemas.openxmlformats.org/wordprocessingml/2006/main" xmlns:w14="http://schemas.microsoft.com/office/word/2010/wordml" xmlns:w15="http://schemas.microsoft.com/office/word/2012/wordml" xmlns:w16cex="http://schemas.microsoft.com/office/word/2018/wordml/cex" xmlns:w16cid="http://schemas.microsoft.com/office/word/2016/wordml/cid" xmlns:w16="http://schemas.microsoft.com/office/word/2018/wordml" xmlns:w16du="http://schemas.microsoft.com/office/word/2023/wordml/word16du" xmlns:w16sdtdh="http://schemas.microsoft.com/office/word/2020/wordml/sdtdatahash" xmlns:w16sdtfl="http://schemas.microsoft.com/office/word/2024/wordml/sdtformatlock" xmlns:w16se="http://schemas.microsoft.com/office/word/2015/wordml/symex" xmlns:wpg="http://schemas.microsoft.com/office/word/2010/wordprocessingGroup" xmlns:wpi="http://schemas.microsoft.com/office/word/2010/wordprocessingInk" xmlns:wne="http://schemas.microsoft.com/office/word/2006/wordml" xmlns:wps="http://schemas.microsoft.com/office/word/2010/wordprocessingShape" mc:Ignorable="w14 w15 w16se w16cid w16 w16cex w16sdtdh w16sdtfl w16du wp14">
+  <w15:commentEx w15:paraId="4317DB2E" w15:done="0"/>
+  <w15:commentEx w15:paraId="11775831" w15:done="0"/>
+  <w15:commentEx w15:paraId="0207CB8C" w15:paraIdParent="11775831" w15:done="0"/>
+  <w15:commentEx w15:paraId="2843E027" w15:done="0"/>
+  <w15:commentEx w15:paraId="181FF1E5" w15:paraIdParent="2843E027" w15:done="0"/>
+  <w15:commentEx w15:paraId="507D1E13" w15:done="0"/>
+  <w15:commentEx w15:paraId="37E39B33" w15:paraIdParent="507D1E13" w15:done="0"/>
+</w15:commentsEx>
+</file>
+
+<file path=word/commentsExtensible.xml><?xml version="1.0" encoding="utf-8"?>
+<w16cex:commentsExtensible xmlns:wpc="http://schemas.microsoft.com/office/word/2010/wordprocessingCanvas" xmlns:cx="http://schemas.microsoft.com/office/drawing/2014/chartex" xmlns:cx1="http://schemas.microsoft.com/office/drawing/2015/9/8/chartex" xmlns:cx2="http://schemas.microsoft.com/office/drawing/2015/10/21/chartex" xmlns:cx3="http://schemas.microsoft.com/office/drawing/2016/5/9/chartex" xmlns:cx4="http://schemas.microsoft.com/office/drawing/2016/5/10/chartex" xmlns:cx5="http://schemas.microsoft.com/office/drawing/2016/5/11/chartex" xmlns:cx6="http://schemas.microsoft.com/office/drawing/2016/5/12/chartex" xmlns:cx7="http://schemas.microsoft.com/office/drawing/2016/5/13/chartex" xmlns:cx8="http://schemas.microsoft.com/office/drawing/2016/5/14/chartex" xmlns:cr="http://schemas.microsoft.com/office/comments/2020/reactions" xmlns:mc="http://schemas.openxmlformats.org/markup-compatibility/2006" xmlns:aink="http://schemas.microsoft.com/office/drawing/2016/ink" xmlns:am3d="http://schemas.microsoft.com/office/drawing/2017/model3d" xmlns:o="urn:schemas-microsoft-com:office:office" xmlns:oel="http://schemas.microsoft.com/office/2019/extlst" xmlns:r="http://schemas.openxmlformats.org/officeDocument/2006/relationships" xmlns:m="http://schemas.openxmlformats.org/officeDocument/2006/math" xmlns:v="urn:schemas-microsoft-com:vml" xmlns:wp14="http://schemas.microsoft.com/office/word/2010/wordprocessingDrawing" xmlns:wp="http://schemas.openxmlformats.org/drawingml/2006/wordprocessingDrawing" xmlns:w10="urn:schemas-microsoft-com:office:word" xmlns:w="http://schemas.openxmlformats.org/wordprocessingml/2006/main" xmlns:w14="http://schemas.microsoft.com/office/word/2010/wordml" xmlns:w15="http://schemas.microsoft.com/office/word/2012/wordml" xmlns:w16cex="http://schemas.microsoft.com/office/word/2018/wordml/cex" xmlns:w16cid="http://schemas.microsoft.com/office/word/2016/wordml/cid" xmlns:w16="http://schemas.microsoft.com/office/word/2018/wordml" xmlns:w16du="http://schemas.microsoft.com/office/word/2023/wordml/word16du" xmlns:w16sdtdh="http://schemas.microsoft.com/office/word/2020/wordml/sdtdatahash" xmlns:w16sdtfl="http://schemas.microsoft.com/office/word/2024/wordml/sdtformatlock" xmlns:w16se="http://schemas.microsoft.com/office/word/2015/wordml/symex" xmlns:wpg="http://schemas.microsoft.com/office/word/2010/wordprocessingGroup" xmlns:wpi="http://schemas.microsoft.com/office/word/2010/wordprocessingInk" xmlns:wne="http://schemas.microsoft.com/office/word/2006/wordml" xmlns:wps="http://schemas.microsoft.com/office/word/2010/wordprocessingShape" mc:Ignorable="w14 w15 w16se w16cid w16 w16cex w16sdtdh w16sdtfl cr w16du wp14">
+  <w16cex:commentExtensible w16cex:durableId="0A95D464" w16cex:dateUtc="2026-03-31T09:54:00Z"/>
+  <w16cex:commentExtensible w16cex:durableId="25987F01" w16cex:dateUtc="2026-03-31T09:59:00Z"/>
+  <w16cex:commentExtensible w16cex:durableId="600394BC" w16cex:dateUtc="2026-03-31T09:59:00Z"/>
+  <w16cex:commentExtensible w16cex:durableId="55FE5CAF" w16cex:dateUtc="2026-03-31T10:01:00Z"/>
+</w16cex:commentsExtensible>
+</file>
+
+<file path=word/commentsIds.xml><?xml version="1.0" encoding="utf-8"?>
+<w16cid:commentsIds xmlns:wpc="http://schemas.microsoft.com/office/word/2010/wordprocessingCanvas" xmlns:cx="http://schemas.microsoft.com/office/drawing/2014/chartex" xmlns:cx1="http://schemas.microsoft.com/office/drawing/2015/9/8/chartex" xmlns:cx2="http://schemas.microsoft.com/office/drawing/2015/10/21/chartex" xmlns:cx3="http://schemas.microsoft.com/office/drawing/2016/5/9/chartex" xmlns:cx4="http://schemas.microsoft.com/office/drawing/2016/5/10/chartex" xmlns:cx5="http://schemas.microsoft.com/office/drawing/2016/5/11/chartex" xmlns:cx6="http://schemas.microsoft.com/office/drawing/2016/5/12/chartex" xmlns:cx7="http://schemas.microsoft.com/office/drawing/2016/5/13/chartex" xmlns:cx8="http://schemas.microsoft.com/office/drawing/2016/5/14/chartex" xmlns:mc="http://schemas.openxmlformats.org/markup-compatibility/2006" xmlns:aink="http://schemas.microsoft.com/office/drawing/2016/ink" xmlns:am3d="http://schemas.microsoft.com/office/drawing/2017/model3d" xmlns:o="urn:schemas-microsoft-com:office:office" xmlns:oel="http://schemas.microsoft.com/office/2019/extlst" xmlns:r="http://schemas.openxmlformats.org/officeDocument/2006/relationships" xmlns:m="http://schemas.openxmlformats.org/officeDocument/2006/math" xmlns:v="urn:schemas-microsoft-com:vml" xmlns:wp14="http://schemas.microsoft.com/office/word/2010/wordprocessingDrawing" xmlns:wp="http://schemas.openxmlformats.org/drawingml/2006/wordprocessingDrawing" xmlns:w10="urn:schemas-microsoft-com:office:word" xmlns:w="http://schemas.openxmlformats.org/wordprocessingml/2006/main" xmlns:w14="http://schemas.microsoft.com/office/word/2010/wordml" xmlns:w15="http://schemas.microsoft.com/office/word/2012/wordml" xmlns:w16cex="http://schemas.microsoft.com/office/word/2018/wordml/cex" xmlns:w16cid="http://schemas.microsoft.com/office/word/2016/wordml/cid" xmlns:w16="http://schemas.microsoft.com/office/word/2018/wordml" xmlns:w16du="http://schemas.microsoft.com/office/word/2023/wordml/word16du" xmlns:w16sdtdh="http://schemas.microsoft.com/office/word/2020/wordml/sdtdatahash" xmlns:w16sdtfl="http://schemas.microsoft.com/office/word/2024/wordml/sdtformatlock" xmlns:w16se="http://schemas.microsoft.com/office/word/2015/wordml/symex" xmlns:wpg="http://schemas.microsoft.com/office/word/2010/wordprocessingGroup" xmlns:wpi="http://schemas.microsoft.com/office/word/2010/wordprocessingInk" xmlns:wne="http://schemas.microsoft.com/office/word/2006/wordml" xmlns:wps="http://schemas.microsoft.com/office/word/2010/wordprocessingShape" mc:Ignorable="w14 w15 w16se w16cid w16 w16cex w16sdtdh w16sdtfl w16du wp14">
+  <w16cid:commentId w16cid:paraId="4317DB2E" w16cid:durableId="0A95D464"/>
+  <w16cid:commentId w16cid:paraId="11775831" w16cid:durableId="11775831"/>
+  <w16cid:commentId w16cid:paraId="0207CB8C" w16cid:durableId="25987F01"/>
+  <w16cid:commentId w16cid:paraId="2843E027" w16cid:durableId="2843E027"/>
+  <w16cid:commentId w16cid:paraId="181FF1E5" w16cid:durableId="600394BC"/>
+  <w16cid:commentId w16cid:paraId="507D1E13" w16cid:durableId="507D1E13"/>
+  <w16cid:commentId w16cid:paraId="37E39B33" w16cid:durableId="55FE5CAF"/>
+</w16cid:commentsIds>
+</file>
+
+<file path=word/endnotes.xml><?xml version="1.0" encoding="utf-8"?>
+<w:endnotes xmlns:wpc="http://schemas.microsoft.com/office/word/2010/wordprocessingCanvas" xmlns:cx="http://schemas.microsoft.com/office/drawing/2014/chartex" xmlns:cx1="http://schemas.microsoft.com/office/drawing/2015/9/8/chartex" xmlns:cx2="http://schemas.microsoft.com/office/drawing/2015/10/21/chartex" xmlns:cx3="http://schemas.microsoft.com/office/drawing/2016/5/9/chartex" xmlns:cx4="http://schemas.microsoft.com/office/drawing/2016/5/10/chartex" xmlns:cx5="http://schemas.microsoft.com/office/drawing/2016/5/11/chartex" xmlns:cx6="http://schemas.microsoft.com/office/drawing/2016/5/12/chartex" xmlns:cx7="http://schemas.microsoft.com/office/drawing/2016/5/13/chartex" xmlns:cx8="http://schemas.microsoft.com/office/drawing/2016/5/14/chartex" xmlns:mc="http://schemas.openxmlformats.org/markup-compatibility/2006" xmlns:aink="http://schemas.microsoft.com/office/drawing/2016/ink" xmlns:am3d="http://schemas.microsoft.com/office/drawing/2017/model3d" xmlns:o="urn:schemas-microsoft-com:office:office" xmlns:oel="http://schemas.microsoft.com/office/2019/extlst" xmlns:r="http://schemas.openxmlformats.org/officeDocument/2006/relationships" xmlns:m="http://schemas.openxmlformats.org/officeDocument/2006/math" xmlns:v="urn:schemas-microsoft-com:vml" xmlns:wp14="http://schemas.microsoft.com/office/word/2010/wordprocessingDrawing" xmlns:wp="http://schemas.openxmlformats.org/drawingml/2006/wordprocessingDrawing" xmlns:w10="urn:schemas-microsoft-com:office:word" xmlns:w="http://schemas.openxmlformats.org/wordprocessingml/2006/main" xmlns:w14="http://schemas.microsoft.com/office/word/2010/wordml" xmlns:w15="http://schemas.microsoft.com/office/word/2012/wordml" xmlns:w16cex="http://schemas.microsoft.com/office/word/2018/wordml/cex" xmlns:w16cid="http://schemas.microsoft.com/office/word/2016/wordml/cid" xmlns:w16="http://schemas.microsoft.com/office/word/2018/wordml" xmlns:w16du="http://schemas.microsoft.com/office/word/2023/wordml/word16du" xmlns:w16sdtdh="http://schemas.microsoft.com/office/word/2020/wordml/sdtdatahash" xmlns:w16sdtfl="http://schemas.microsoft.com/office/word/2024/wordml/sdtformatlock" xmlns:w16se="http://schemas.microsoft.com/office/word/2015/wordml/symex" xmlns:wpg="http://schemas.microsoft.com/office/word/2010/wordprocessingGroup" xmlns:wpi="http://schemas.microsoft.com/office/word/2010/wordprocessingInk" xmlns:wne="http://schemas.microsoft.com/office/word/2006/wordml" xmlns:wps="http://schemas.microsoft.com/office/word/2010/wordprocessingShape" mc:Ignorable="w14 w15 w16se w16cid w16 w16cex w16sdtdh w16sdtfl w16du wp14">
+  <w:endnote w:type="separator" w:id="-1">
+    <w:p>
+      <w:pPr>
+        <w:spacing w:after="0" w:line="240" w:lineRule="auto"/>
+      </w:pPr>
+      <w:r>
+        <w:separator/>
+      </w:r>
+    </w:p>
+  </w:endnote>
+  <w:endnote w:type="continuationSeparator" w:id="0">
+    <w:p>
+      <w:pPr>
+        <w:spacing w:after="0" w:line="240" w:lineRule="auto"/>
+      </w:pPr>
+      <w:r>
+        <w:continuationSeparator/>
+      </w:r>
+    </w:p>
+  </w:endnote>
+</w:endnotes>
+</file>
+
+<file path=word/footnotes.xml><?xml version="1.0" encoding="utf-8"?>
+<w:footnotes xmlns:wpc="http://schemas.microsoft.com/office/word/2010/wordprocessingCanvas" xmlns:cx="http://schemas.microsoft.com/office/drawing/2014/chartex" xmlns:cx1="http://schemas.microsoft.com/office/drawing/2015/9/8/chartex" xmlns:cx2="http://schemas.microsoft.com/office/drawing/2015/10/21/chartex" xmlns:cx3="http://schemas.microsoft.com/office/drawing/2016/5/9/chartex" xmlns:cx4="http://schemas.microsoft.com/office/drawing/2016/5/10/chartex" xmlns:cx5="http://schemas.microsoft.com/office/drawing/2016/5/11/chartex" xmlns:cx6="http://schemas.microsoft.com/office/drawing/2016/5/12/chartex" xmlns:cx7="http://schemas.microsoft.com/office/drawing/2016/5/13/chartex" xmlns:cx8="http://schemas.microsoft.com/office/drawing/2016/5/14/chartex" xmlns:mc="http://schemas.openxmlformats.org/markup-compatibility/2006" xmlns:aink="http://schemas.microsoft.com/office/drawing/2016/ink" xmlns:am3d="http://schemas.microsoft.com/office/drawing/2017/model3d" xmlns:o="urn:schemas-microsoft-com:office:office" xmlns:oel="http://schemas.microsoft.com/office/2019/extlst" xmlns:r="http://schemas.openxmlformats.org/officeDocument/2006/relationships" xmlns:m="http://schemas.openxmlformats.org/officeDocument/2006/math" xmlns:v="urn:schemas-microsoft-com:vml" xmlns:wp14="http://schemas.microsoft.com/office/word/2010/wordprocessingDrawing" xmlns:wp="http://schemas.openxmlformats.org/drawingml/2006/wordprocessingDrawing" xmlns:w10="urn:schemas-microsoft-com:office:word" xmlns:w="http://schemas.openxmlformats.org/wordprocessingml/2006/main" xmlns:w14="http://schemas.microsoft.com/office/word/2010/wordml" xmlns:w15="http://schemas.microsoft.com/office/word/2012/wordml" xmlns:w16cex="http://schemas.microsoft.com/office/word/2018/wordml/cex" xmlns:w16cid="http://schemas.microsoft.com/office/word/2016/wordml/cid" xmlns:w16="http://schemas.microsoft.com/office/word/2018/wordml" xmlns:w16du="http://schemas.microsoft.com/office/word/2023/wordml/word16du" xmlns:w16sdtdh="http://schemas.microsoft.com/office/word/2020/wordml/sdtdatahash" xmlns:w16sdtfl="http://schemas.microsoft.com/office/word/2024/wordml/sdtformatlock" xmlns:w16se="http://schemas.microsoft.com/office/word/2015/wordml/symex" xmlns:wpg="http://schemas.microsoft.com/office/word/2010/wordprocessingGroup" xmlns:wpi="http://schemas.microsoft.com/office/word/2010/wordprocessingInk" xmlns:wne="http://schemas.microsoft.com/office/word/2006/wordml" xmlns:wps="http://schemas.microsoft.com/office/word/2010/wordprocessingShape" mc:Ignorable="w14 w15 w16se w16cid w16 w16cex w16sdtdh w16sdtfl w16du wp14">
+  <w:footnote w:type="separator" w:id="-1">
+    <w:p>
+      <w:pPr>
+        <w:spacing w:after="0" w:line="240" w:lineRule="auto"/>
+      </w:pPr>
+      <w:r>
+        <w:separator/>
+      </w:r>
+    </w:p>
+  </w:footnote>
+  <w:footnote w:type="continuationSeparator" w:id="0">
+    <w:p>
+      <w:pPr>
+        <w:spacing w:after="0" w:line="240" w:lineRule="auto"/>
+      </w:pPr>
+      <w:r>
+        <w:continuationSeparator/>
+      </w:r>
+    </w:p>
+  </w:footnote>
+</w:footnotes>
+</file>
+
 <file path=word/numbering.xml><?xml version="1.0" encoding="utf-8"?>
 <w:numbering xmlns:wpc="http://schemas.microsoft.com/office/word/2010/wordprocessingCanvas" xmlns:cx="http://schemas.microsoft.com/office/drawing/2014/chartex" xmlns:cx1="http://schemas.microsoft.com/office/drawing/2015/9/8/chartex" xmlns:cx2="http://schemas.microsoft.com/office/drawing/2015/10/21/chartex" xmlns:cx3="http://schemas.microsoft.com/office/drawing/2016/5/9/chartex" xmlns:cx4="http://schemas.microsoft.com/office/drawing/2016/5/10/chartex" xmlns:cx5="http://schemas.microsoft.com/office/drawing/2016/5/11/chartex" xmlns:cx6="http://schemas.microsoft.com/office/drawing/2016/5/12/chartex" xmlns:cx7="http://schemas.microsoft.com/office/drawing/2016/5/13/chartex" xmlns:cx8="http://schemas.microsoft.com/office/drawing/2016/5/14/chartex" xmlns:mc="http://schemas.openxmlformats.org/markup-compatibility/2006" xmlns:aink="http://schemas.microsoft.com/office/drawing/2016/ink" xmlns:am3d="http://schemas.microsoft.com/office/drawing/2017/model3d" xmlns:o="urn:schemas-microsoft-com:office:office" xmlns:oel="http://schemas.microsoft.com/office/2019/extlst" xmlns:r="http://schemas.openxmlformats.org/officeDocument/2006/relationships" xmlns:m="http://schemas.openxmlformats.org/officeDocument/2006/math" xmlns:v="urn:schemas-microsoft-com:vml" xmlns:wp14="http://schemas.microsoft.com/office/word/2010/wordprocessingDrawing" xmlns:wp="http://schemas.openxmlformats.org/drawingml/2006/wordprocessingDrawing" xmlns:w10="urn:schemas-microsoft-com:office:word" xmlns:w="http://schemas.openxmlformats.org/wordprocessingml/2006/main" xmlns:w14="http://schemas.microsoft.com/office/word/2010/wordml" xmlns:w15="http://schemas.microsoft.com/office/word/2012/wordml" xmlns:w16cex="http://schemas.microsoft.com/office/word/2018/wordml/cex" xmlns:w16cid="http://schemas.microsoft.com/office/word/2016/wordml/cid" xmlns:w16="http://schemas.microsoft.com/office/word/2018/wordml" xmlns:w16du="http://schemas.microsoft.com/office/word/2023/wordml/word16du" xmlns:w16sdtdh="http://schemas.microsoft.com/office/word/2020/wordml/sdtdatahash" xmlns:w16sdtfl="http://schemas.microsoft.com/office/word/2024/wordml/sdtformatlock" xmlns:w16se="http://schemas.microsoft.com/office/word/2015/wordml/symex" xmlns:wpg="http://schemas.microsoft.com/office/word/2010/wordprocessingGroup" xmlns:wpi="http://schemas.microsoft.com/office/word/2010/wordprocessingInk" xmlns:wne="http://schemas.microsoft.com/office/word/2006/wordml" xmlns:wps="http://schemas.microsoft.com/office/word/2010/wordprocessingShape" mc:Ignorable="w14 w15 w16se w16cid w16 w16cex w16sdtdh w16sdtfl w16du wp14">
   <w:abstractNum w:abstractNumId="0" w15:restartNumberingAfterBreak="0">
+    <w:nsid w:val="26C63216"/>
+    <w:multiLevelType w:val="hybridMultilevel"/>
+    <w:tmpl w:val="0442A1C6"/>
+    <w:lvl w:ilvl="0" w:tplc="2BD28634">
+      <w:start w:val="3"/>
+      <w:numFmt w:val="bullet"/>
+      <w:lvlText w:val=""/>
+      <w:lvlJc w:val="left"/>
+      <w:pPr>
+        <w:ind w:left="720" w:hanging="360"/>
+      </w:pPr>
+      <w:rPr>
+        <w:rFonts w:ascii="Wingdings" w:eastAsiaTheme="minorEastAsia" w:hAnsi="Wingdings" w:cstheme="minorBidi" w:hint="default"/>
+      </w:rPr>
+    </w:lvl>
+    <w:lvl w:ilvl="1" w:tplc="08090003" w:tentative="1">
+      <w:start w:val="1"/>
+      <w:numFmt w:val="bullet"/>
+      <w:lvlText w:val="o"/>
+      <w:lvlJc w:val="left"/>
+      <w:pPr>
+        <w:ind w:left="1440" w:hanging="360"/>
+      </w:pPr>
+      <w:rPr>
+        <w:rFonts w:ascii="Courier New" w:hAnsi="Courier New" w:cs="Courier New" w:hint="default"/>
+      </w:rPr>
+    </w:lvl>
+    <w:lvl w:ilvl="2" w:tplc="08090005" w:tentative="1">
+      <w:start w:val="1"/>
+      <w:numFmt w:val="bullet"/>
+      <w:lvlText w:val=""/>
+      <w:lvlJc w:val="left"/>
+      <w:pPr>
+        <w:ind w:left="2160" w:hanging="360"/>
+      </w:pPr>
+      <w:rPr>
+        <w:rFonts w:ascii="Wingdings" w:hAnsi="Wingdings" w:hint="default"/>
+      </w:rPr>
+    </w:lvl>
+    <w:lvl w:ilvl="3" w:tplc="08090001" w:tentative="1">
+      <w:start w:val="1"/>
+      <w:numFmt w:val="bullet"/>
+      <w:lvlText w:val=""/>
+      <w:lvlJc w:val="left"/>
+      <w:pPr>
+        <w:ind w:left="2880" w:hanging="360"/>
+      </w:pPr>
+      <w:rPr>
+        <w:rFonts w:ascii="Symbol" w:hAnsi="Symbol" w:hint="default"/>
+      </w:rPr>
+    </w:lvl>
+    <w:lvl w:ilvl="4" w:tplc="08090003" w:tentative="1">
+      <w:start w:val="1"/>
+      <w:numFmt w:val="bullet"/>
+      <w:lvlText w:val="o"/>
+      <w:lvlJc w:val="left"/>
+      <w:pPr>
+        <w:ind w:left="3600" w:hanging="360"/>
+      </w:pPr>
+      <w:rPr>
+        <w:rFonts w:ascii="Courier New" w:hAnsi="Courier New" w:cs="Courier New" w:hint="default"/>
+      </w:rPr>
+    </w:lvl>
+    <w:lvl w:ilvl="5" w:tplc="08090005" w:tentative="1">
+      <w:start w:val="1"/>
+      <w:numFmt w:val="bullet"/>
+      <w:lvlText w:val=""/>
+      <w:lvlJc w:val="left"/>
+      <w:pPr>
+        <w:ind w:left="4320" w:hanging="360"/>
+      </w:pPr>
+      <w:rPr>
+        <w:rFonts w:ascii="Wingdings" w:hAnsi="Wingdings" w:hint="default"/>
+      </w:rPr>
+    </w:lvl>
+    <w:lvl w:ilvl="6" w:tplc="08090001" w:tentative="1">
+      <w:start w:val="1"/>
+      <w:numFmt w:val="bullet"/>
+      <w:lvlText w:val=""/>
+      <w:lvlJc w:val="left"/>
+      <w:pPr>
+        <w:ind w:left="5040" w:hanging="360"/>
+      </w:pPr>
+      <w:rPr>
+        <w:rFonts w:ascii="Symbol" w:hAnsi="Symbol" w:hint="default"/>
+      </w:rPr>
+    </w:lvl>
+    <w:lvl w:ilvl="7" w:tplc="08090003" w:tentative="1">
+      <w:start w:val="1"/>
+      <w:numFmt w:val="bullet"/>
+      <w:lvlText w:val="o"/>
+      <w:lvlJc w:val="left"/>
+      <w:pPr>
+        <w:ind w:left="5760" w:hanging="360"/>
+      </w:pPr>
+      <w:rPr>
+        <w:rFonts w:ascii="Courier New" w:hAnsi="Courier New" w:cs="Courier New" w:hint="default"/>
+      </w:rPr>
+    </w:lvl>
+    <w:lvl w:ilvl="8" w:tplc="08090005" w:tentative="1">
+      <w:start w:val="1"/>
+      <w:numFmt w:val="bullet"/>
+      <w:lvlText w:val=""/>
+      <w:lvlJc w:val="left"/>
+      <w:pPr>
+        <w:ind w:left="6480" w:hanging="360"/>
+      </w:pPr>
+      <w:rPr>
+        <w:rFonts w:ascii="Wingdings" w:hAnsi="Wingdings" w:hint="default"/>
+      </w:rPr>
+    </w:lvl>
+  </w:abstractNum>
+  <w:abstractNum w:abstractNumId="1" w15:restartNumberingAfterBreak="0">
     <w:nsid w:val="3B9D3C08"/>
     <w:multiLevelType w:val="hybridMultilevel"/>
     <w:tmpl w:val="83E2127E"/>
@@ -1038,10 +2851,24 @@
       </w:rPr>
     </w:lvl>
   </w:abstractNum>
-  <w:num w:numId="1" w16cid:durableId="463088140">
+  <w:num w:numId="1" w16cid:durableId="688334629">
+    <w:abstractNumId w:val="1"/>
+  </w:num>
+  <w:num w:numId="2" w16cid:durableId="628390626">
     <w:abstractNumId w:val="0"/>
   </w:num>
 </w:numbering>
+</file>
+
+<file path=word/people.xml><?xml version="1.0" encoding="utf-8"?>
+<w15:people xmlns:wpc="http://schemas.microsoft.com/office/word/2010/wordprocessingCanvas" xmlns:cx="http://schemas.microsoft.com/office/drawing/2014/chartex" xmlns:cx1="http://schemas.microsoft.com/office/drawing/2015/9/8/chartex" xmlns:cx2="http://schemas.microsoft.com/office/drawing/2015/10/21/chartex" xmlns:cx3="http://schemas.microsoft.com/office/drawing/2016/5/9/chartex" xmlns:cx4="http://schemas.microsoft.com/office/drawing/2016/5/10/chartex" xmlns:cx5="http://schemas.microsoft.com/office/drawing/2016/5/11/chartex" xmlns:cx6="http://schemas.microsoft.com/office/drawing/2016/5/12/chartex" xmlns:cx7="http://schemas.microsoft.com/office/drawing/2016/5/13/chartex" xmlns:cx8="http://schemas.microsoft.com/office/drawing/2016/5/14/chartex" xmlns:mc="http://schemas.openxmlformats.org/markup-compatibility/2006" xmlns:aink="http://schemas.microsoft.com/office/drawing/2016/ink" xmlns:am3d="http://schemas.microsoft.com/office/drawing/2017/model3d" xmlns:o="urn:schemas-microsoft-com:office:office" xmlns:oel="http://schemas.microsoft.com/office/2019/extlst" xmlns:r="http://schemas.openxmlformats.org/officeDocument/2006/relationships" xmlns:m="http://schemas.openxmlformats.org/officeDocument/2006/math" xmlns:v="urn:schemas-microsoft-com:vml" xmlns:wp14="http://schemas.microsoft.com/office/word/2010/wordprocessingDrawing" xmlns:wp="http://schemas.openxmlformats.org/drawingml/2006/wordprocessingDrawing" xmlns:w10="urn:schemas-microsoft-com:office:word" xmlns:w="http://schemas.openxmlformats.org/wordprocessingml/2006/main" xmlns:w14="http://schemas.microsoft.com/office/word/2010/wordml" xmlns:w15="http://schemas.microsoft.com/office/word/2012/wordml" xmlns:w16cex="http://schemas.microsoft.com/office/word/2018/wordml/cex" xmlns:w16cid="http://schemas.microsoft.com/office/word/2016/wordml/cid" xmlns:w16="http://schemas.microsoft.com/office/word/2018/wordml" xmlns:w16du="http://schemas.microsoft.com/office/word/2023/wordml/word16du" xmlns:w16sdtdh="http://schemas.microsoft.com/office/word/2020/wordml/sdtdatahash" xmlns:w16sdtfl="http://schemas.microsoft.com/office/word/2024/wordml/sdtformatlock" xmlns:w16se="http://schemas.microsoft.com/office/word/2015/wordml/symex" xmlns:wpg="http://schemas.microsoft.com/office/word/2010/wordprocessingGroup" xmlns:wpi="http://schemas.microsoft.com/office/word/2010/wordprocessingInk" xmlns:wne="http://schemas.microsoft.com/office/word/2006/wordml" xmlns:wps="http://schemas.microsoft.com/office/word/2010/wordprocessingShape" mc:Ignorable="w14 w15 w16se w16cid w16 w16cex w16sdtdh w16sdtfl w16du wp14">
+  <w15:person w15:author="Davis, Nigel">
+    <w15:presenceInfo w15:providerId="AD" w15:userId="S::ndavis@ciena.com::c29b3813-a1f4-40e2-a213-c1c0b0befa0c"/>
+  </w15:person>
+  <w15:person w15:author="杨三威10099490">
+    <w15:presenceInfo w15:providerId="AD" w15:userId="S-1-5-21-2769701484-3501533552-3326990446-1003"/>
+  </w15:person>
+</w15:people>
 </file>
 
 <file path=word/styles.xml><?xml version="1.0" encoding="utf-8"?>
@@ -1049,7 +2876,7 @@
   <w:docDefaults>
     <w:rPrDefault>
       <w:rPr>
-        <w:rFonts w:asciiTheme="minorHAnsi" w:eastAsiaTheme="minorHAnsi" w:hAnsiTheme="minorHAnsi" w:cstheme="minorBidi"/>
+        <w:rFonts w:asciiTheme="minorHAnsi" w:eastAsiaTheme="minorEastAsia" w:hAnsiTheme="minorHAnsi" w:cstheme="minorBidi"/>
         <w:kern w:val="2"/>
         <w:sz w:val="24"/>
         <w:szCs w:val="24"/>
@@ -1103,7 +2930,7 @@
     <w:lsdException w:name="envelope address" w:semiHidden="1" w:unhideWhenUsed="1"/>
     <w:lsdException w:name="envelope return" w:semiHidden="1" w:unhideWhenUsed="1"/>
     <w:lsdException w:name="footnote reference" w:semiHidden="1" w:unhideWhenUsed="1"/>
-    <w:lsdException w:name="annotation reference" w:semiHidden="1" w:unhideWhenUsed="1"/>
+    <w:lsdException w:name="annotation reference" w:semiHidden="1" w:unhideWhenUsed="1" w:qFormat="1"/>
     <w:lsdException w:name="line number" w:semiHidden="1" w:unhideWhenUsed="1"/>
     <w:lsdException w:name="page number" w:semiHidden="1" w:unhideWhenUsed="1"/>
     <w:lsdException w:name="endnote reference" w:semiHidden="1" w:unhideWhenUsed="1"/>
@@ -1218,7 +3045,7 @@
     <w:lsdException w:name="Table Web 2" w:semiHidden="1" w:unhideWhenUsed="1"/>
     <w:lsdException w:name="Table Web 3" w:semiHidden="1" w:unhideWhenUsed="1"/>
     <w:lsdException w:name="Balloon Text" w:semiHidden="1" w:unhideWhenUsed="1"/>
-    <w:lsdException w:name="Table Grid" w:uiPriority="39"/>
+    <w:lsdException w:name="Table Grid" w:uiPriority="59"/>
     <w:lsdException w:name="Table Theme" w:semiHidden="1" w:unhideWhenUsed="1"/>
     <w:lsdException w:name="Placeholder Text" w:semiHidden="1"/>
     <w:lsdException w:name="No Spacing" w:uiPriority="1" w:qFormat="1"/>
@@ -1958,6 +3785,191 @@
       <w:color w:val="0F4761" w:themeColor="accent1" w:themeShade="BF"/>
       <w:spacing w:val="5"/>
     </w:rPr>
+  </w:style>
+  <w:style w:type="paragraph" w:styleId="Header">
+    <w:name w:val="header"/>
+    <w:basedOn w:val="Normal"/>
+    <w:link w:val="HeaderChar"/>
+    <w:uiPriority w:val="99"/>
+    <w:unhideWhenUsed/>
+    <w:rsid w:val="0022428B"/>
+    <w:pPr>
+      <w:pBdr>
+        <w:bottom w:val="single" w:sz="6" w:space="1" w:color="auto"/>
+      </w:pBdr>
+      <w:tabs>
+        <w:tab w:val="center" w:pos="4153"/>
+        <w:tab w:val="right" w:pos="8306"/>
+      </w:tabs>
+      <w:snapToGrid w:val="0"/>
+      <w:spacing w:line="240" w:lineRule="auto"/>
+      <w:jc w:val="center"/>
+    </w:pPr>
+    <w:rPr>
+      <w:sz w:val="18"/>
+      <w:szCs w:val="18"/>
+    </w:rPr>
+  </w:style>
+  <w:style w:type="character" w:customStyle="1" w:styleId="HeaderChar">
+    <w:name w:val="Header Char"/>
+    <w:basedOn w:val="DefaultParagraphFont"/>
+    <w:link w:val="Header"/>
+    <w:uiPriority w:val="99"/>
+    <w:rsid w:val="0022428B"/>
+    <w:rPr>
+      <w:sz w:val="18"/>
+      <w:szCs w:val="18"/>
+    </w:rPr>
+  </w:style>
+  <w:style w:type="paragraph" w:styleId="Footer">
+    <w:name w:val="footer"/>
+    <w:basedOn w:val="Normal"/>
+    <w:link w:val="FooterChar"/>
+    <w:uiPriority w:val="99"/>
+    <w:unhideWhenUsed/>
+    <w:rsid w:val="0022428B"/>
+    <w:pPr>
+      <w:tabs>
+        <w:tab w:val="center" w:pos="4153"/>
+        <w:tab w:val="right" w:pos="8306"/>
+      </w:tabs>
+      <w:snapToGrid w:val="0"/>
+      <w:spacing w:line="240" w:lineRule="auto"/>
+    </w:pPr>
+    <w:rPr>
+      <w:sz w:val="18"/>
+      <w:szCs w:val="18"/>
+    </w:rPr>
+  </w:style>
+  <w:style w:type="character" w:customStyle="1" w:styleId="FooterChar">
+    <w:name w:val="Footer Char"/>
+    <w:basedOn w:val="DefaultParagraphFont"/>
+    <w:link w:val="Footer"/>
+    <w:uiPriority w:val="99"/>
+    <w:rsid w:val="0022428B"/>
+    <w:rPr>
+      <w:sz w:val="18"/>
+      <w:szCs w:val="18"/>
+    </w:rPr>
+  </w:style>
+  <w:style w:type="character" w:styleId="CommentReference">
+    <w:name w:val="annotation reference"/>
+    <w:basedOn w:val="DefaultParagraphFont"/>
+    <w:uiPriority w:val="99"/>
+    <w:semiHidden/>
+    <w:unhideWhenUsed/>
+    <w:qFormat/>
+    <w:rsid w:val="0022428B"/>
+    <w:rPr>
+      <w:sz w:val="16"/>
+      <w:szCs w:val="16"/>
+    </w:rPr>
+  </w:style>
+  <w:style w:type="table" w:styleId="TableGrid">
+    <w:name w:val="Table Grid"/>
+    <w:basedOn w:val="TableNormal"/>
+    <w:uiPriority w:val="59"/>
+    <w:rsid w:val="0022428B"/>
+    <w:pPr>
+      <w:spacing w:after="0" w:line="240" w:lineRule="auto"/>
+    </w:pPr>
+    <w:rPr>
+      <w:rFonts w:ascii="Times New Roman" w:eastAsia="SimSun" w:hAnsi="Times New Roman" w:cs="Times New Roman"/>
+      <w:kern w:val="0"/>
+      <w:sz w:val="20"/>
+      <w:szCs w:val="20"/>
+      <w:lang w:val="en-US" w:eastAsia="zh-CN"/>
+      <w14:ligatures w14:val="none"/>
+    </w:rPr>
+    <w:tblPr>
+      <w:tblBorders>
+        <w:top w:val="single" w:sz="4" w:space="0" w:color="auto"/>
+        <w:left w:val="single" w:sz="4" w:space="0" w:color="auto"/>
+        <w:bottom w:val="single" w:sz="4" w:space="0" w:color="auto"/>
+        <w:right w:val="single" w:sz="4" w:space="0" w:color="auto"/>
+        <w:insideH w:val="single" w:sz="4" w:space="0" w:color="auto"/>
+        <w:insideV w:val="single" w:sz="4" w:space="0" w:color="auto"/>
+      </w:tblBorders>
+    </w:tblPr>
+  </w:style>
+  <w:style w:type="paragraph" w:styleId="BalloonText">
+    <w:name w:val="Balloon Text"/>
+    <w:basedOn w:val="Normal"/>
+    <w:link w:val="BalloonTextChar"/>
+    <w:uiPriority w:val="99"/>
+    <w:semiHidden/>
+    <w:unhideWhenUsed/>
+    <w:rsid w:val="0022428B"/>
+    <w:pPr>
+      <w:spacing w:after="0" w:line="240" w:lineRule="auto"/>
+    </w:pPr>
+    <w:rPr>
+      <w:sz w:val="18"/>
+      <w:szCs w:val="18"/>
+    </w:rPr>
+  </w:style>
+  <w:style w:type="character" w:customStyle="1" w:styleId="BalloonTextChar">
+    <w:name w:val="Balloon Text Char"/>
+    <w:basedOn w:val="DefaultParagraphFont"/>
+    <w:link w:val="BalloonText"/>
+    <w:uiPriority w:val="99"/>
+    <w:semiHidden/>
+    <w:rsid w:val="0022428B"/>
+    <w:rPr>
+      <w:sz w:val="18"/>
+      <w:szCs w:val="18"/>
+    </w:rPr>
+  </w:style>
+  <w:style w:type="paragraph" w:styleId="CommentText">
+    <w:name w:val="annotation text"/>
+    <w:basedOn w:val="Normal"/>
+    <w:link w:val="CommentTextChar"/>
+    <w:uiPriority w:val="99"/>
+    <w:unhideWhenUsed/>
+    <w:rsid w:val="0022428B"/>
+  </w:style>
+  <w:style w:type="character" w:customStyle="1" w:styleId="CommentTextChar">
+    <w:name w:val="Comment Text Char"/>
+    <w:basedOn w:val="DefaultParagraphFont"/>
+    <w:link w:val="CommentText"/>
+    <w:uiPriority w:val="99"/>
+    <w:rsid w:val="0022428B"/>
+  </w:style>
+  <w:style w:type="paragraph" w:styleId="CommentSubject">
+    <w:name w:val="annotation subject"/>
+    <w:basedOn w:val="CommentText"/>
+    <w:next w:val="CommentText"/>
+    <w:link w:val="CommentSubjectChar"/>
+    <w:uiPriority w:val="99"/>
+    <w:semiHidden/>
+    <w:unhideWhenUsed/>
+    <w:rsid w:val="0022428B"/>
+    <w:rPr>
+      <w:b/>
+      <w:bCs/>
+    </w:rPr>
+  </w:style>
+  <w:style w:type="character" w:customStyle="1" w:styleId="CommentSubjectChar">
+    <w:name w:val="Comment Subject Char"/>
+    <w:basedOn w:val="CommentTextChar"/>
+    <w:link w:val="CommentSubject"/>
+    <w:uiPriority w:val="99"/>
+    <w:semiHidden/>
+    <w:rsid w:val="0022428B"/>
+    <w:rPr>
+      <w:b/>
+      <w:bCs/>
+    </w:rPr>
+  </w:style>
+  <w:style w:type="paragraph" w:styleId="Revision">
+    <w:name w:val="Revision"/>
+    <w:hidden/>
+    <w:uiPriority w:val="99"/>
+    <w:semiHidden/>
+    <w:rsid w:val="00B20609"/>
+    <w:pPr>
+      <w:spacing w:after="0" w:line="240" w:lineRule="auto"/>
+    </w:pPr>
   </w:style>
 </w:styles>
 </file>
@@ -2255,4 +4267,16 @@
     </a:ext>
   </a:extLst>
 </a:theme>
+</file>
+
+<file path=customXml/item1.xml><?xml version="1.0" encoding="utf-8"?>
+<b:Sources xmlns:b="http://schemas.openxmlformats.org/officeDocument/2006/bibliography" xmlns="http://schemas.openxmlformats.org/officeDocument/2006/bibliography" SelectedStyle="\APASixthEditionOfficeOnline.xsl" StyleName="APA" Version="6"/>
+</file>
+
+<file path=customXml/itemProps1.xml><?xml version="1.0" encoding="utf-8"?>
+<ds:datastoreItem xmlns:ds="http://schemas.openxmlformats.org/officeDocument/2006/customXml" ds:itemID="{5A106F76-78A2-48E2-8463-E01437DFB377}">
+  <ds:schemaRefs>
+    <ds:schemaRef ds:uri="http://schemas.openxmlformats.org/officeDocument/2006/bibliography"/>
+  </ds:schemaRefs>
+</ds:datastoreItem>
 </file>
</xml_diff>